<commit_message>
info debt: pielikts novērtējums
</commit_message>
<xml_diff>
--- a/projektesanas_parskats.docx
+++ b/projektesanas_parskats.docx
@@ -1325,52 +1325,16 @@
           <w:color w:val="1F2328"/>
           <w:lang w:val="lv-LV"/>
         </w:rPr>
-        <w:t xml:space="preserve">Mūsu komanda bija izvēlējusies veidot projektu Universitātes gaisa kvalitātes pārvaldības sistēma. Pēc sarunas ar “pasūtītāju” iezīmējām galvenos lietotāja stāstus. </w:t>
-      </w:r>
-      <w:proofErr w:type="spellStart"/>
+        <w:t>Mūsu komanda bija izvēlējusies veidot projektu Universitātes gaisa kvalitātes pārvaldības sistēma. Pēc sarunas ar “pasūtītāju” iezīmējām galvenos lietotāja stāstus. Tākā viens no stāstiem bija saslēgšana, tad realizējām 3 dažādu interfeisu sensorus, un vienu no tiem kalibrējām paši.</w:t>
+      </w:r>
       <w:r>
         <w:rPr>
           <w:rFonts w:ascii="Segoe UI" w:hAnsi="Segoe UI" w:cs="Segoe UI"/>
           <w:color w:val="1F2328"/>
           <w:lang w:val="lv-LV"/>
         </w:rPr>
-        <w:t>Tākā</w:t>
-      </w:r>
-      <w:proofErr w:type="spellEnd"/>
-      <w:r>
-        <w:rPr>
-          <w:rFonts w:ascii="Segoe UI" w:hAnsi="Segoe UI" w:cs="Segoe UI"/>
-          <w:color w:val="1F2328"/>
-          <w:lang w:val="lv-LV"/>
-        </w:rPr>
-        <w:t xml:space="preserve"> viens no stāstiem bija saslēgšana, tad realizējām 3 dažādu interfeisu sensorus, un vienu no tiem kalibrējām paši.</w:t>
-      </w:r>
-      <w:r>
-        <w:rPr>
-          <w:rFonts w:ascii="Segoe UI" w:hAnsi="Segoe UI" w:cs="Segoe UI"/>
-          <w:color w:val="1F2328"/>
-          <w:lang w:val="lv-LV"/>
-        </w:rPr>
         <w:br/>
-        <w:t xml:space="preserve">Lai gan mūsu komandā bija pamanāmi cilvēki ar ideālistiskiem skatījumiem, tomēr jāņem vērā, ka nav dzirdēts par plašai publikai brīvi pieejamiem nemirstības risinājumiem, kas nozīmē, ka projekta izstrādei ir tikai neliels laika resurss, kas nozīmē, ka jākoncentrējas uz MVP sasniegšanu, nevis jāiedziļinās dažādos interesantās </w:t>
-      </w:r>
-      <w:proofErr w:type="spellStart"/>
-      <w:r>
-        <w:rPr>
-          <w:rFonts w:ascii="Segoe UI" w:hAnsi="Segoe UI" w:cs="Segoe UI"/>
-          <w:color w:val="1F2328"/>
-          <w:lang w:val="lv-LV"/>
-        </w:rPr>
-        <w:t>blakusnodarbēs</w:t>
-      </w:r>
-      <w:proofErr w:type="spellEnd"/>
-      <w:r>
-        <w:rPr>
-          <w:rFonts w:ascii="Segoe UI" w:hAnsi="Segoe UI" w:cs="Segoe UI"/>
-          <w:color w:val="1F2328"/>
-          <w:lang w:val="lv-LV"/>
-        </w:rPr>
-        <w:t xml:space="preserve"> kā absolūtās drošības meklējumi, neskaitāmu interfeisu izmēģināšana un tamlīdzīgi.</w:t>
+        <w:t>Lai gan mūsu komandā bija pamanāmi cilvēki ar ideālistiskiem skatījumiem, tomēr jāņem vērā, ka nav dzirdēts par plašai publikai brīvi pieejamiem nemirstības risinājumiem, kas nozīmē, ka projekta izstrādei ir tikai neliels laika resurss, kas nozīmē, ka jākoncentrējas uz MVP sasniegšanu, nevis jāiedziļinās dažādos interesantās blakusnodarbēs kā absolūtās drošības meklējumi, neskaitāmu interfeisu izmēģināšana un tamlīdzīgi.</w:t>
       </w:r>
     </w:p>
     <w:p>
@@ -1410,43 +1374,7 @@
           <w:color w:val="1F2328"/>
           <w:lang w:val="lv-LV"/>
         </w:rPr>
-        <w:t xml:space="preserve">Nosakot vadlīnijas, nolēmām, ka sekošanu </w:t>
-      </w:r>
-      <w:proofErr w:type="spellStart"/>
-      <w:r>
-        <w:rPr>
-          <w:rFonts w:ascii="Segoe UI" w:hAnsi="Segoe UI" w:cs="Segoe UI"/>
-          <w:color w:val="1F2328"/>
-          <w:lang w:val="lv-LV"/>
-        </w:rPr>
-        <w:t>hype</w:t>
-      </w:r>
-      <w:proofErr w:type="spellEnd"/>
-      <w:r>
-        <w:rPr>
-          <w:rFonts w:ascii="Segoe UI" w:hAnsi="Segoe UI" w:cs="Segoe UI"/>
-          <w:color w:val="1F2328"/>
-          <w:lang w:val="lv-LV"/>
-        </w:rPr>
-        <w:t xml:space="preserve"> un dažādiem modes zīmoliem šeit </w:t>
-      </w:r>
-      <w:proofErr w:type="spellStart"/>
-      <w:r>
-        <w:rPr>
-          <w:rFonts w:ascii="Segoe UI" w:hAnsi="Segoe UI" w:cs="Segoe UI"/>
-          <w:color w:val="1F2328"/>
-          <w:lang w:val="lv-LV"/>
-        </w:rPr>
-        <w:t>neprioritizēsim</w:t>
-      </w:r>
-      <w:proofErr w:type="spellEnd"/>
-      <w:r>
-        <w:rPr>
-          <w:rFonts w:ascii="Segoe UI" w:hAnsi="Segoe UI" w:cs="Segoe UI"/>
-          <w:color w:val="1F2328"/>
-          <w:lang w:val="lv-LV"/>
-        </w:rPr>
-        <w:t>, bet tieši pretēji - vērsīsim skatus uz pietiekami ilgi esošām sistēmām ar maksimāli iespējamo koda caurredzamību, tajā pašā laikā kā jau ļoti limitētu resursu sistēmās, neaizmirstot par resursu limitiem.</w:t>
+        <w:t>Nosakot vadlīnijas, nolēmām, ka sekošanu hype un dažādiem modes zīmoliem šeit neprioritizēsim, bet tieši pretēji - vērsīsim skatus uz pietiekami ilgi esošām sistēmām ar maksimāli iespējamo koda caurredzamību, tajā pašā laikā kā jau ļoti limitētu resursu sistēmās, neaizmirstot par resursu limitiem.</w:t>
       </w:r>
     </w:p>
     <w:p>
@@ -1466,97 +1394,7 @@
           <w:color w:val="1F2328"/>
           <w:lang w:val="lv-LV"/>
         </w:rPr>
-        <w:t xml:space="preserve">Tāpēc izvēlējāmies </w:t>
-      </w:r>
-      <w:proofErr w:type="spellStart"/>
-      <w:r>
-        <w:rPr>
-          <w:rFonts w:ascii="Segoe UI" w:hAnsi="Segoe UI" w:cs="Segoe UI"/>
-          <w:color w:val="1F2328"/>
-          <w:lang w:val="lv-LV"/>
-        </w:rPr>
-        <w:t>python</w:t>
-      </w:r>
-      <w:proofErr w:type="spellEnd"/>
-      <w:r>
-        <w:rPr>
-          <w:rFonts w:ascii="Segoe UI" w:hAnsi="Segoe UI" w:cs="Segoe UI"/>
-          <w:color w:val="1F2328"/>
-          <w:lang w:val="lv-LV"/>
-        </w:rPr>
-        <w:t xml:space="preserve">, un tikai divos gadījumos: </w:t>
-      </w:r>
-      <w:proofErr w:type="spellStart"/>
-      <w:r>
-        <w:rPr>
-          <w:rFonts w:ascii="Segoe UI" w:hAnsi="Segoe UI" w:cs="Segoe UI"/>
-          <w:color w:val="1F2328"/>
-          <w:lang w:val="lv-LV"/>
-        </w:rPr>
-        <w:t>webkameras</w:t>
-      </w:r>
-      <w:proofErr w:type="spellEnd"/>
-      <w:r>
-        <w:rPr>
-          <w:rFonts w:ascii="Segoe UI" w:hAnsi="Segoe UI" w:cs="Segoe UI"/>
-          <w:color w:val="1F2328"/>
-          <w:lang w:val="lv-LV"/>
-        </w:rPr>
-        <w:t xml:space="preserve"> blakus mini projektā un industriālā 4-20mA </w:t>
-      </w:r>
-      <w:proofErr w:type="spellStart"/>
-      <w:r>
-        <w:rPr>
-          <w:rFonts w:ascii="Segoe UI" w:hAnsi="Segoe UI" w:cs="Segoe UI"/>
-          <w:color w:val="1F2328"/>
-          <w:lang w:val="lv-LV"/>
-        </w:rPr>
-        <w:t>standartsensora</w:t>
-      </w:r>
-      <w:proofErr w:type="spellEnd"/>
-      <w:r>
-        <w:rPr>
-          <w:rFonts w:ascii="Segoe UI" w:hAnsi="Segoe UI" w:cs="Segoe UI"/>
-          <w:color w:val="1F2328"/>
-          <w:lang w:val="lv-LV"/>
-        </w:rPr>
-        <w:t xml:space="preserve"> gadījumā, lietojām c++. Pirmajā gadījumā jo kamerai bija kritiski nepieciešama operatīvā atmiņa, bet sensora gadījumā - jo kontrolierim ar augstākas izšķirtspējas ADC </w:t>
-      </w:r>
-      <w:proofErr w:type="spellStart"/>
-      <w:r>
-        <w:rPr>
-          <w:rFonts w:ascii="Segoe UI" w:hAnsi="Segoe UI" w:cs="Segoe UI"/>
-          <w:color w:val="1F2328"/>
-          <w:lang w:val="lv-LV"/>
-        </w:rPr>
-        <w:t>micropython</w:t>
-      </w:r>
-      <w:proofErr w:type="spellEnd"/>
-      <w:r>
-        <w:rPr>
-          <w:rFonts w:ascii="Segoe UI" w:hAnsi="Segoe UI" w:cs="Segoe UI"/>
-          <w:color w:val="1F2328"/>
-          <w:lang w:val="lv-LV"/>
-        </w:rPr>
-        <w:t xml:space="preserve"> netiek uzturēts, kas nozīmē ka liekot savu portu, ļoti ievērojami daudz laika aizietu </w:t>
-      </w:r>
-      <w:proofErr w:type="spellStart"/>
-      <w:r>
-        <w:rPr>
-          <w:rFonts w:ascii="Segoe UI" w:hAnsi="Segoe UI" w:cs="Segoe UI"/>
-          <w:color w:val="1F2328"/>
-          <w:lang w:val="lv-LV"/>
-        </w:rPr>
-        <w:t>mappinga</w:t>
-      </w:r>
-      <w:proofErr w:type="spellEnd"/>
-      <w:r>
-        <w:rPr>
-          <w:rFonts w:ascii="Segoe UI" w:hAnsi="Segoe UI" w:cs="Segoe UI"/>
-          <w:color w:val="1F2328"/>
-          <w:lang w:val="lv-LV"/>
-        </w:rPr>
-        <w:t>, testēšanas un citos uzdevumos, kas acīmredzami nebūtu laika resursa daudzuma ziņā samērīgi ar projekta kopējo laika resursu.</w:t>
+        <w:t>Tāpēc izvēlējāmies python, un tikai divos gadījumos: webkameras blakus mini projektā un industriālā 4-20mA standartsensora gadījumā, lietojām c++. Pirmajā gadījumā jo kamerai bija kritiski nepieciešama operatīvā atmiņa, bet sensora gadījumā - jo kontrolierim ar augstākas izšķirtspējas ADC micropython netiek uzturēts, kas nozīmē ka liekot savu portu, ļoti ievērojami daudz laika aizietu mappinga, testēšanas un citos uzdevumos, kas acīmredzami nebūtu laika resursa daudzuma ziņā samērīgi ar projekta kopējo laika resursu.</w:t>
       </w:r>
     </w:p>
     <w:p>
@@ -1570,310 +1408,30 @@
           <w:lang w:val="lv-LV"/>
         </w:rPr>
       </w:pPr>
-      <w:proofErr w:type="spellStart"/>
       <w:r>
         <w:rPr>
           <w:rFonts w:ascii="Segoe UI" w:hAnsi="Segoe UI" w:cs="Segoe UI"/>
           <w:color w:val="1F2328"/>
           <w:lang w:val="lv-LV"/>
         </w:rPr>
-        <w:t>Mikrokontrolieru</w:t>
-      </w:r>
-      <w:proofErr w:type="spellEnd"/>
+        <w:t xml:space="preserve">Mikrokontrolieru kods ir asinhronu uzdevumu struktūrā veidots, un pat zemākā gala kontrolieris (esp32) to spēja izpildīt, pat esot uz operatīvās atmiņas pārpildes robežas. (jāpiezīmē, ka ja kodā atstāja 5 sensorus, jau pie izpildes bija kļūda ka nepietiek RAM. Saīsinot kodu uz 2 sensoriem viss atkal strādāja). </w:t>
+      </w:r>
       <w:r>
         <w:rPr>
           <w:rFonts w:ascii="Segoe UI" w:hAnsi="Segoe UI" w:cs="Segoe UI"/>
           <w:color w:val="1F2328"/>
           <w:lang w:val="lv-LV"/>
         </w:rPr>
-        <w:t xml:space="preserve"> kods ir asinhronu uzdevumu struktūrā veidots, un pat zemākā gala kontrolieris (esp32) to spēja izpildīt, pat esot uz operatīvās atmiņas </w:t>
-      </w:r>
-      <w:proofErr w:type="spellStart"/>
+        <w:br/>
+        <w:t>Arī API endpointu kods ir tajā pašā asyncio satvarā veidots. Arhivators turpretī ir sinhrons, jo tas ir vienlaikus viens uzdevums, tāpēc asinhromums ir lieks. Savukārt lietotāja saskarne ir salikts projekts, sastāvošs no Grafana, kas rakstīta go valodā un pielieto react un angular javascript satvarus un no Django satvarā veidotas CRUD un maršrutēšanas lietotnes</w:t>
+      </w:r>
       <w:r>
         <w:rPr>
           <w:rFonts w:ascii="Segoe UI" w:hAnsi="Segoe UI" w:cs="Segoe UI"/>
           <w:color w:val="1F2328"/>
           <w:lang w:val="lv-LV"/>
         </w:rPr>
-        <w:t>pārpildes</w:t>
-      </w:r>
-      <w:proofErr w:type="spellEnd"/>
-      <w:r>
-        <w:rPr>
-          <w:rFonts w:ascii="Segoe UI" w:hAnsi="Segoe UI" w:cs="Segoe UI"/>
-          <w:color w:val="1F2328"/>
-          <w:lang w:val="lv-LV"/>
-        </w:rPr>
-        <w:t xml:space="preserve"> robežas. (jāpiezīmē, ka ja kodā atstāja 5 sensorus, jau pie izpildes bija kļūda ka nepietiek RAM. Saīsinot kodu uz 2 sensoriem viss atkal strādāja). </w:t>
-      </w:r>
-      <w:r>
-        <w:rPr>
-          <w:rFonts w:ascii="Segoe UI" w:hAnsi="Segoe UI" w:cs="Segoe UI"/>
-          <w:color w:val="1F2328"/>
-          <w:lang w:val="lv-LV"/>
-        </w:rPr>
-        <w:br/>
-        <w:t xml:space="preserve">Arī API </w:t>
-      </w:r>
-      <w:proofErr w:type="spellStart"/>
-      <w:r>
-        <w:rPr>
-          <w:rFonts w:ascii="Segoe UI" w:hAnsi="Segoe UI" w:cs="Segoe UI"/>
-          <w:color w:val="1F2328"/>
-          <w:lang w:val="lv-LV"/>
-        </w:rPr>
-        <w:t>endpointu</w:t>
-      </w:r>
-      <w:proofErr w:type="spellEnd"/>
-      <w:r>
-        <w:rPr>
-          <w:rFonts w:ascii="Segoe UI" w:hAnsi="Segoe UI" w:cs="Segoe UI"/>
-          <w:color w:val="1F2328"/>
-          <w:lang w:val="lv-LV"/>
-        </w:rPr>
-        <w:t xml:space="preserve"> kods ir tajā pašā </w:t>
-      </w:r>
-      <w:proofErr w:type="spellStart"/>
-      <w:r>
-        <w:rPr>
-          <w:rFonts w:ascii="Segoe UI" w:hAnsi="Segoe UI" w:cs="Segoe UI"/>
-          <w:color w:val="1F2328"/>
-          <w:lang w:val="lv-LV"/>
-        </w:rPr>
-        <w:t>asyncio</w:t>
-      </w:r>
-      <w:proofErr w:type="spellEnd"/>
-      <w:r>
-        <w:rPr>
-          <w:rFonts w:ascii="Segoe UI" w:hAnsi="Segoe UI" w:cs="Segoe UI"/>
-          <w:color w:val="1F2328"/>
-          <w:lang w:val="lv-LV"/>
-        </w:rPr>
-        <w:t xml:space="preserve"> satvarā veidots. </w:t>
-      </w:r>
-      <w:proofErr w:type="spellStart"/>
-      <w:r>
-        <w:rPr>
-          <w:rFonts w:ascii="Segoe UI" w:hAnsi="Segoe UI" w:cs="Segoe UI"/>
-          <w:color w:val="1F2328"/>
-          <w:lang w:val="lv-LV"/>
-        </w:rPr>
-        <w:t>Arhivators</w:t>
-      </w:r>
-      <w:proofErr w:type="spellEnd"/>
-      <w:r>
-        <w:rPr>
-          <w:rFonts w:ascii="Segoe UI" w:hAnsi="Segoe UI" w:cs="Segoe UI"/>
-          <w:color w:val="1F2328"/>
-          <w:lang w:val="lv-LV"/>
-        </w:rPr>
-        <w:t xml:space="preserve"> turpretī ir sinhrons, jo tas ir vienlaikus viens uzdevums, tāpēc </w:t>
-      </w:r>
-      <w:proofErr w:type="spellStart"/>
-      <w:r>
-        <w:rPr>
-          <w:rFonts w:ascii="Segoe UI" w:hAnsi="Segoe UI" w:cs="Segoe UI"/>
-          <w:color w:val="1F2328"/>
-          <w:lang w:val="lv-LV"/>
-        </w:rPr>
-        <w:t>asinhromums</w:t>
-      </w:r>
-      <w:proofErr w:type="spellEnd"/>
-      <w:r>
-        <w:rPr>
-          <w:rFonts w:ascii="Segoe UI" w:hAnsi="Segoe UI" w:cs="Segoe UI"/>
-          <w:color w:val="1F2328"/>
-          <w:lang w:val="lv-LV"/>
-        </w:rPr>
-        <w:t xml:space="preserve"> ir lieks. Savukārt lietotāja </w:t>
-      </w:r>
-      <w:proofErr w:type="spellStart"/>
-      <w:r>
-        <w:rPr>
-          <w:rFonts w:ascii="Segoe UI" w:hAnsi="Segoe UI" w:cs="Segoe UI"/>
-          <w:color w:val="1F2328"/>
-          <w:lang w:val="lv-LV"/>
-        </w:rPr>
-        <w:t>saskarne</w:t>
-      </w:r>
-      <w:proofErr w:type="spellEnd"/>
-      <w:r>
-        <w:rPr>
-          <w:rFonts w:ascii="Segoe UI" w:hAnsi="Segoe UI" w:cs="Segoe UI"/>
-          <w:color w:val="1F2328"/>
-          <w:lang w:val="lv-LV"/>
-        </w:rPr>
-        <w:t xml:space="preserve"> ir salikts projekts, sastāvošs no </w:t>
-      </w:r>
-      <w:proofErr w:type="spellStart"/>
-      <w:r>
-        <w:rPr>
-          <w:rFonts w:ascii="Segoe UI" w:hAnsi="Segoe UI" w:cs="Segoe UI"/>
-          <w:color w:val="1F2328"/>
-          <w:lang w:val="lv-LV"/>
-        </w:rPr>
-        <w:t>Grafana</w:t>
-      </w:r>
-      <w:proofErr w:type="spellEnd"/>
-      <w:r>
-        <w:rPr>
-          <w:rFonts w:ascii="Segoe UI" w:hAnsi="Segoe UI" w:cs="Segoe UI"/>
-          <w:color w:val="1F2328"/>
-          <w:lang w:val="lv-LV"/>
-        </w:rPr>
-        <w:t xml:space="preserve">, kas rakstīta </w:t>
-      </w:r>
-      <w:proofErr w:type="spellStart"/>
-      <w:r>
-        <w:rPr>
-          <w:rFonts w:ascii="Segoe UI" w:hAnsi="Segoe UI" w:cs="Segoe UI"/>
-          <w:color w:val="1F2328"/>
-          <w:lang w:val="lv-LV"/>
-        </w:rPr>
-        <w:t>go</w:t>
-      </w:r>
-      <w:proofErr w:type="spellEnd"/>
-      <w:r>
-        <w:rPr>
-          <w:rFonts w:ascii="Segoe UI" w:hAnsi="Segoe UI" w:cs="Segoe UI"/>
-          <w:color w:val="1F2328"/>
-          <w:lang w:val="lv-LV"/>
-        </w:rPr>
-        <w:t xml:space="preserve"> valodā un pielieto </w:t>
-      </w:r>
-      <w:proofErr w:type="spellStart"/>
-      <w:r>
-        <w:rPr>
-          <w:rFonts w:ascii="Segoe UI" w:hAnsi="Segoe UI" w:cs="Segoe UI"/>
-          <w:color w:val="1F2328"/>
-          <w:lang w:val="lv-LV"/>
-        </w:rPr>
-        <w:t>react</w:t>
-      </w:r>
-      <w:proofErr w:type="spellEnd"/>
-      <w:r>
-        <w:rPr>
-          <w:rFonts w:ascii="Segoe UI" w:hAnsi="Segoe UI" w:cs="Segoe UI"/>
-          <w:color w:val="1F2328"/>
-          <w:lang w:val="lv-LV"/>
-        </w:rPr>
-        <w:t xml:space="preserve"> un </w:t>
-      </w:r>
-      <w:proofErr w:type="spellStart"/>
-      <w:r>
-        <w:rPr>
-          <w:rFonts w:ascii="Segoe UI" w:hAnsi="Segoe UI" w:cs="Segoe UI"/>
-          <w:color w:val="1F2328"/>
-          <w:lang w:val="lv-LV"/>
-        </w:rPr>
-        <w:t>angular</w:t>
-      </w:r>
-      <w:proofErr w:type="spellEnd"/>
-      <w:r>
-        <w:rPr>
-          <w:rFonts w:ascii="Segoe UI" w:hAnsi="Segoe UI" w:cs="Segoe UI"/>
-          <w:color w:val="1F2328"/>
-          <w:lang w:val="lv-LV"/>
-        </w:rPr>
-        <w:t xml:space="preserve"> </w:t>
-      </w:r>
-      <w:proofErr w:type="spellStart"/>
-      <w:r>
-        <w:rPr>
-          <w:rFonts w:ascii="Segoe UI" w:hAnsi="Segoe UI" w:cs="Segoe UI"/>
-          <w:color w:val="1F2328"/>
-          <w:lang w:val="lv-LV"/>
-        </w:rPr>
-        <w:t>javascript</w:t>
-      </w:r>
-      <w:proofErr w:type="spellEnd"/>
-      <w:r>
-        <w:rPr>
-          <w:rFonts w:ascii="Segoe UI" w:hAnsi="Segoe UI" w:cs="Segoe UI"/>
-          <w:color w:val="1F2328"/>
-          <w:lang w:val="lv-LV"/>
-        </w:rPr>
-        <w:t xml:space="preserve"> satvarus un no </w:t>
-      </w:r>
-      <w:proofErr w:type="spellStart"/>
-      <w:r>
-        <w:rPr>
-          <w:rFonts w:ascii="Segoe UI" w:hAnsi="Segoe UI" w:cs="Segoe UI"/>
-          <w:color w:val="1F2328"/>
-          <w:lang w:val="lv-LV"/>
-        </w:rPr>
-        <w:t>Django</w:t>
-      </w:r>
-      <w:proofErr w:type="spellEnd"/>
-      <w:r>
-        <w:rPr>
-          <w:rFonts w:ascii="Segoe UI" w:hAnsi="Segoe UI" w:cs="Segoe UI"/>
-          <w:color w:val="1F2328"/>
-          <w:lang w:val="lv-LV"/>
-        </w:rPr>
-        <w:t xml:space="preserve"> satvarā veidotas CRUD un maršrutēšanas lietotnes</w:t>
-      </w:r>
-      <w:r>
-        <w:rPr>
-          <w:rFonts w:ascii="Segoe UI" w:hAnsi="Segoe UI" w:cs="Segoe UI"/>
-          <w:color w:val="1F2328"/>
-          <w:lang w:val="lv-LV"/>
-        </w:rPr>
-        <w:t xml:space="preserve">, kas pielieto </w:t>
-      </w:r>
-      <w:proofErr w:type="spellStart"/>
-      <w:r>
-        <w:rPr>
-          <w:rFonts w:ascii="Segoe UI" w:hAnsi="Segoe UI" w:cs="Segoe UI"/>
-          <w:color w:val="1F2328"/>
-          <w:lang w:val="lv-LV"/>
-        </w:rPr>
-        <w:t>DataTables</w:t>
-      </w:r>
-      <w:proofErr w:type="spellEnd"/>
-      <w:r>
-        <w:rPr>
-          <w:rFonts w:ascii="Segoe UI" w:hAnsi="Segoe UI" w:cs="Segoe UI"/>
-          <w:color w:val="1F2328"/>
-          <w:lang w:val="lv-LV"/>
-        </w:rPr>
-        <w:t xml:space="preserve"> </w:t>
-      </w:r>
-      <w:proofErr w:type="spellStart"/>
-      <w:r>
-        <w:rPr>
-          <w:rFonts w:ascii="Segoe UI" w:hAnsi="Segoe UI" w:cs="Segoe UI"/>
-          <w:color w:val="1F2328"/>
-          <w:lang w:val="lv-LV"/>
-        </w:rPr>
-        <w:t>javascript</w:t>
-      </w:r>
-      <w:proofErr w:type="spellEnd"/>
-      <w:r>
-        <w:rPr>
-          <w:rFonts w:ascii="Segoe UI" w:hAnsi="Segoe UI" w:cs="Segoe UI"/>
-          <w:color w:val="1F2328"/>
-          <w:lang w:val="lv-LV"/>
-        </w:rPr>
-        <w:t xml:space="preserve"> satvaru sarakstu kārtošanai un meklēšanai, jo </w:t>
-      </w:r>
-      <w:proofErr w:type="spellStart"/>
-      <w:r>
-        <w:rPr>
-          <w:rFonts w:ascii="Segoe UI" w:hAnsi="Segoe UI" w:cs="Segoe UI"/>
-          <w:color w:val="1F2328"/>
-          <w:lang w:val="lv-LV"/>
-        </w:rPr>
-        <w:t>Django</w:t>
-      </w:r>
-      <w:proofErr w:type="spellEnd"/>
-      <w:r>
-        <w:rPr>
-          <w:rFonts w:ascii="Segoe UI" w:hAnsi="Segoe UI" w:cs="Segoe UI"/>
-          <w:color w:val="1F2328"/>
-          <w:lang w:val="lv-LV"/>
-        </w:rPr>
-        <w:t xml:space="preserve"> diemžēl modeļus atlasīja ievērojami lēni.</w:t>
+        <w:t>, kas pielieto DataTables javascript satvaru sarakstu kārtošanai un meklēšanai, jo Django diemžēl modeļus atlasīja ievērojami lēni.</w:t>
       </w:r>
     </w:p>
     <w:p>
@@ -2012,21 +1570,7 @@
         <w:rPr>
           <w:lang w:val="lv-LV"/>
         </w:rPr>
-        <w:t xml:space="preserve"> pēc iespējas vairākos lietotāja stāstos </w:t>
-      </w:r>
-      <w:proofErr w:type="spellStart"/>
-      <w:r>
-        <w:rPr>
-          <w:lang w:val="lv-LV"/>
-        </w:rPr>
-        <w:t>nosauko</w:t>
-      </w:r>
-      <w:proofErr w:type="spellEnd"/>
-      <w:r>
-        <w:rPr>
-          <w:lang w:val="lv-LV"/>
-        </w:rPr>
-        <w:t xml:space="preserve"> prasību aspektos, kā arī vai ir vai arī ja nav, tad vai ir samērā vienkārši un ātri realizējamas drošības prasības.</w:t>
+        <w:t xml:space="preserve"> pēc iespējas vairākos lietotāja stāstos nosauko prasību aspektos, kā arī vai ir vai arī ja nav, tad vai ir samērā vienkārši un ātri realizējamas drošības prasības.</w:t>
       </w:r>
       <w:r>
         <w:rPr>
@@ -2044,7 +1588,6 @@
         </w:rPr>
       </w:pPr>
       <w:bookmarkStart w:id="2" w:name="_Toc156100816"/>
-      <w:proofErr w:type="spellStart"/>
       <w:r>
         <w:rPr>
           <w:rStyle w:val="Heading1Char"/>
@@ -2052,7 +1595,6 @@
         <w:lastRenderedPageBreak/>
         <w:t>Līdzīgo</w:t>
       </w:r>
-      <w:proofErr w:type="spellEnd"/>
       <w:r>
         <w:rPr>
           <w:rStyle w:val="Heading1Char"/>
@@ -2078,7 +1620,7 @@
         <w:pStyle w:val="ListParagraph"/>
         <w:numPr>
           <w:ilvl w:val="0"/>
-          <w:numId w:val="11"/>
+          <w:numId w:val="14"/>
         </w:numPr>
         <w:spacing w:line="259" w:lineRule="auto"/>
         <w:rPr>
@@ -2089,9 +1631,14 @@
         <w:rPr>
           <w:lang w:val="lv-LV"/>
         </w:rPr>
+        <w:t xml:space="preserve"> </w:t>
+      </w:r>
+      <w:r>
+        <w:rPr>
+          <w:lang w:val="lv-LV"/>
+        </w:rPr>
         <w:t xml:space="preserve">CISCO sensors </w:t>
       </w:r>
-      <w:proofErr w:type="spellStart"/>
       <w:r>
         <w:rPr>
           <w:rFonts w:ascii="Segoe UI" w:hAnsi="Segoe UI" w:cs="Segoe UI"/>
@@ -2099,17 +1646,7 @@
           <w:shd w:val="clear" w:color="auto" w:fill="FFFFFF"/>
           <w:lang w:val="lv-LV"/>
         </w:rPr>
-        <w:t>Meraki</w:t>
-      </w:r>
-      <w:proofErr w:type="spellEnd"/>
-      <w:r>
-        <w:rPr>
-          <w:rFonts w:ascii="Segoe UI" w:hAnsi="Segoe UI" w:cs="Segoe UI"/>
-          <w:color w:val="1F2328"/>
-          <w:shd w:val="clear" w:color="auto" w:fill="FFFFFF"/>
-          <w:lang w:val="lv-LV"/>
-        </w:rPr>
-        <w:t xml:space="preserve"> MT14</w:t>
+        <w:t>Meraki MT14</w:t>
       </w:r>
       <w:r>
         <w:rPr>
@@ -2155,7 +1692,7 @@
         <w:pStyle w:val="ListParagraph"/>
         <w:numPr>
           <w:ilvl w:val="0"/>
-          <w:numId w:val="11"/>
+          <w:numId w:val="14"/>
         </w:numPr>
         <w:spacing w:line="259" w:lineRule="auto"/>
         <w:rPr>
@@ -2166,21 +1703,215 @@
         <w:rPr>
           <w:lang w:val="lv-LV"/>
         </w:rPr>
-        <w:t xml:space="preserve">Tech </w:t>
-      </w:r>
-      <w:proofErr w:type="spellStart"/>
-      <w:r>
-        <w:rPr>
-          <w:lang w:val="lv-LV"/>
-        </w:rPr>
-        <w:t>stack</w:t>
-      </w:r>
-      <w:proofErr w:type="spellEnd"/>
-      <w:r>
-        <w:rPr>
-          <w:lang w:val="lv-LV"/>
-        </w:rPr>
-        <w:t xml:space="preserve"> alternatīvas:</w:t>
+        <w:t xml:space="preserve">CO2 sensors </w:t>
+      </w:r>
+      <w:r>
+        <w:rPr>
+          <w:lang w:val="lv-LV"/>
+        </w:rPr>
+        <w:t>DP-353</w:t>
+      </w:r>
+      <w:r>
+        <w:rPr>
+          <w:lang w:val="lv-LV"/>
+        </w:rPr>
+        <w:t xml:space="preserve"> </w:t>
+      </w:r>
+      <w:r>
+        <w:rPr>
+          <w:lang w:val="lv-LV"/>
+        </w:rPr>
+        <w:t>(</w:t>
+      </w:r>
+      <w:hyperlink r:id="rId9" w:history="1">
+        <w:r>
+          <w:rPr>
+            <w:rStyle w:val="Hyperlink"/>
+            <w:lang w:val="lv-LV"/>
+          </w:rPr>
+          <w:t>https://www.amazon.com/Detector-Monitor-Display-Humidity-Temperature/dp/B0BMGF21RT?th=1</w:t>
+        </w:r>
+      </w:hyperlink>
+      <w:r>
+        <w:rPr>
+          <w:lang w:val="lv-LV"/>
+        </w:rPr>
+        <w:t xml:space="preserve"> )</w:t>
+      </w:r>
+    </w:p>
+    <w:p>
+      <w:pPr>
+        <w:pStyle w:val="ListParagraph"/>
+        <w:numPr>
+          <w:ilvl w:val="0"/>
+          <w:numId w:val="14"/>
+        </w:numPr>
+        <w:spacing w:line="259" w:lineRule="auto"/>
+        <w:rPr>
+          <w:lang w:val="lv-LV"/>
+        </w:rPr>
+      </w:pPr>
+      <w:r>
+        <w:rPr>
+          <w:lang w:val="lv-LV"/>
+        </w:rPr>
+        <w:t xml:space="preserve">ELRO </w:t>
+      </w:r>
+      <w:r>
+        <w:rPr>
+          <w:lang w:val="lv-LV"/>
+        </w:rPr>
+        <w:t>Connects SF500CO2 CO2 Meter Kit</w:t>
+      </w:r>
+      <w:r>
+        <w:rPr>
+          <w:lang w:val="lv-LV"/>
+        </w:rPr>
+        <w:t xml:space="preserve"> (</w:t>
+      </w:r>
+      <w:hyperlink r:id="rId10" w:history="1">
+        <w:r>
+          <w:rPr>
+            <w:rStyle w:val="Hyperlink"/>
+            <w:lang w:val="lv-LV"/>
+          </w:rPr>
+          <w:t>https://www.elro.eu/en/elro-connects-smart-wifi-co2-meter-kit-complete-set-with-linkable-air-quality-meter-k2-connector-sf500co2</w:t>
+        </w:r>
+      </w:hyperlink>
+      <w:r>
+        <w:rPr>
+          <w:lang w:val="lv-LV"/>
+        </w:rPr>
+        <w:t xml:space="preserve"> )</w:t>
+      </w:r>
+    </w:p>
+    <w:p>
+      <w:pPr>
+        <w:pStyle w:val="ListParagraph"/>
+        <w:numPr>
+          <w:ilvl w:val="0"/>
+          <w:numId w:val="14"/>
+        </w:numPr>
+        <w:spacing w:line="259" w:lineRule="auto"/>
+        <w:rPr>
+          <w:lang w:val="lv-LV"/>
+        </w:rPr>
+      </w:pPr>
+      <w:r>
+        <w:rPr>
+          <w:lang w:val="lv-LV"/>
+        </w:rPr>
+        <w:t>D</w:t>
+      </w:r>
+      <w:r>
+        <w:rPr>
+          <w:lang w:val="lv-LV"/>
+        </w:rPr>
+        <w:t>isruptive</w:t>
+      </w:r>
+      <w:r>
+        <w:rPr>
+          <w:lang w:val="lv-LV"/>
+        </w:rPr>
+        <w:t xml:space="preserve"> T</w:t>
+      </w:r>
+      <w:r>
+        <w:rPr>
+          <w:lang w:val="lv-LV"/>
+        </w:rPr>
+        <w:t>echnologies</w:t>
+      </w:r>
+      <w:r>
+        <w:rPr>
+          <w:lang w:val="lv-LV"/>
+        </w:rPr>
+        <w:t xml:space="preserve"> </w:t>
+      </w:r>
+      <w:r>
+        <w:rPr>
+          <w:lang w:val="lv-LV"/>
+        </w:rPr>
+        <w:t>Sensor Starter Kit</w:t>
+      </w:r>
+      <w:r>
+        <w:rPr>
+          <w:lang w:val="lv-LV"/>
+        </w:rPr>
+        <w:t xml:space="preserve"> (</w:t>
+      </w:r>
+      <w:hyperlink r:id="rId11" w:history="1">
+        <w:r>
+          <w:rPr>
+            <w:rStyle w:val="Hyperlink"/>
+            <w:lang w:val="lv-LV"/>
+          </w:rPr>
+          <w:t>https://www.disruptive-technologies.com/products/wireless-co2-sensor</w:t>
+        </w:r>
+      </w:hyperlink>
+      <w:r>
+        <w:rPr>
+          <w:lang w:val="lv-LV"/>
+        </w:rPr>
+        <w:t xml:space="preserve"> )</w:t>
+      </w:r>
+    </w:p>
+    <w:p>
+      <w:pPr>
+        <w:pStyle w:val="ListParagraph"/>
+        <w:numPr>
+          <w:ilvl w:val="0"/>
+          <w:numId w:val="14"/>
+        </w:numPr>
+        <w:spacing w:line="259" w:lineRule="auto"/>
+        <w:rPr>
+          <w:lang w:val="lv-LV"/>
+        </w:rPr>
+      </w:pPr>
+      <w:r>
+        <w:rPr>
+          <w:lang w:val="lv-LV"/>
+        </w:rPr>
+        <w:t>WiFi Smart 3 In 1 Carbon Dioxide Air Quality Monitor Detector Temperature and Humidity Sensor</w:t>
+      </w:r>
+      <w:r>
+        <w:rPr>
+          <w:lang w:val="lv-LV"/>
+        </w:rPr>
+        <w:t xml:space="preserve"> (</w:t>
+      </w:r>
+      <w:hyperlink r:id="rId12" w:history="1">
+        <w:r>
+          <w:rPr>
+            <w:rStyle w:val="Hyperlink"/>
+            <w:lang w:val="lv-LV"/>
+          </w:rPr>
+          <w:t>https://moeshouse.com/products/wifi-3-in-1-co2-monitor</w:t>
+        </w:r>
+      </w:hyperlink>
+      <w:r>
+        <w:rPr>
+          <w:lang w:val="lv-LV"/>
+        </w:rPr>
+        <w:t xml:space="preserve"> TUYA smart)</w:t>
+      </w:r>
+    </w:p>
+    <w:p>
+      <w:pPr>
+        <w:pStyle w:val="ListParagraph"/>
+        <w:numPr>
+          <w:ilvl w:val="0"/>
+          <w:numId w:val="14"/>
+        </w:numPr>
+        <w:spacing w:line="259" w:lineRule="auto"/>
+        <w:rPr>
+          <w:lang w:val="lv-LV"/>
+        </w:rPr>
+      </w:pPr>
+      <w:r>
+        <w:rPr>
+          <w:lang w:val="lv-LV"/>
+        </w:rPr>
+        <w:t>Tech stack alternatīvas:</w:t>
       </w:r>
     </w:p>
     <w:p>
@@ -2188,14 +1919,13 @@
         <w:pStyle w:val="ListParagraph"/>
         <w:numPr>
           <w:ilvl w:val="1"/>
-          <w:numId w:val="11"/>
+          <w:numId w:val="14"/>
         </w:numPr>
         <w:spacing w:line="259" w:lineRule="auto"/>
         <w:rPr>
           <w:lang w:val="lv-LV"/>
         </w:rPr>
       </w:pPr>
-      <w:proofErr w:type="spellStart"/>
       <w:r>
         <w:rPr>
           <w:rFonts w:ascii="Arial" w:hAnsi="Arial" w:cs="Arial"/>
@@ -2205,9 +1935,21 @@
           <w:shd w:val="clear" w:color="auto" w:fill="F9F9F9"/>
           <w:lang w:val="lv-LV"/>
         </w:rPr>
-        <w:t>openHAB</w:t>
-      </w:r>
-      <w:proofErr w:type="spellEnd"/>
+        <w:t>openHAB un kontrolieri kā mqqt klienti</w:t>
+      </w:r>
+    </w:p>
+    <w:p>
+      <w:pPr>
+        <w:pStyle w:val="ListParagraph"/>
+        <w:numPr>
+          <w:ilvl w:val="1"/>
+          <w:numId w:val="14"/>
+        </w:numPr>
+        <w:spacing w:line="259" w:lineRule="auto"/>
+        <w:rPr>
+          <w:lang w:val="lv-LV"/>
+        </w:rPr>
+      </w:pPr>
       <w:r>
         <w:rPr>
           <w:rFonts w:ascii="Arial" w:hAnsi="Arial" w:cs="Arial"/>
@@ -2217,94 +1959,9 @@
           <w:shd w:val="clear" w:color="auto" w:fill="F9F9F9"/>
           <w:lang w:val="lv-LV"/>
         </w:rPr>
-        <w:t xml:space="preserve"> un kontrolieri kā </w:t>
-      </w:r>
-      <w:proofErr w:type="spellStart"/>
-      <w:r>
-        <w:rPr>
-          <w:rFonts w:ascii="Arial" w:hAnsi="Arial" w:cs="Arial"/>
-          <w:color w:val="222222"/>
-          <w:sz w:val="23"/>
-          <w:szCs w:val="23"/>
-          <w:shd w:val="clear" w:color="auto" w:fill="F9F9F9"/>
-          <w:lang w:val="lv-LV"/>
-        </w:rPr>
-        <w:t>mqqt</w:t>
-      </w:r>
-      <w:proofErr w:type="spellEnd"/>
-      <w:r>
-        <w:rPr>
-          <w:rFonts w:ascii="Arial" w:hAnsi="Arial" w:cs="Arial"/>
-          <w:color w:val="222222"/>
-          <w:sz w:val="23"/>
-          <w:szCs w:val="23"/>
-          <w:shd w:val="clear" w:color="auto" w:fill="F9F9F9"/>
-          <w:lang w:val="lv-LV"/>
-        </w:rPr>
-        <w:t xml:space="preserve"> klienti</w:t>
-      </w:r>
-    </w:p>
-    <w:p>
-      <w:pPr>
-        <w:pStyle w:val="ListParagraph"/>
-        <w:numPr>
-          <w:ilvl w:val="1"/>
-          <w:numId w:val="11"/>
-        </w:numPr>
-        <w:spacing w:line="259" w:lineRule="auto"/>
-        <w:rPr>
-          <w:lang w:val="lv-LV"/>
-        </w:rPr>
-      </w:pPr>
-      <w:proofErr w:type="spellStart"/>
-      <w:r>
-        <w:rPr>
-          <w:rFonts w:ascii="Arial" w:hAnsi="Arial" w:cs="Arial"/>
-          <w:color w:val="222222"/>
-          <w:sz w:val="23"/>
-          <w:szCs w:val="23"/>
-          <w:shd w:val="clear" w:color="auto" w:fill="F9F9F9"/>
-          <w:lang w:val="lv-LV"/>
-        </w:rPr>
-        <w:t>freeRTOS</w:t>
-      </w:r>
-      <w:proofErr w:type="spellEnd"/>
-      <w:r>
-        <w:rPr>
-          <w:rFonts w:ascii="Arial" w:hAnsi="Arial" w:cs="Arial"/>
-          <w:color w:val="222222"/>
-          <w:sz w:val="23"/>
-          <w:szCs w:val="23"/>
-          <w:shd w:val="clear" w:color="auto" w:fill="F9F9F9"/>
-          <w:lang w:val="lv-LV"/>
-        </w:rPr>
-        <w:t xml:space="preserve"> uz </w:t>
-      </w:r>
-      <w:proofErr w:type="spellStart"/>
-      <w:r>
-        <w:rPr>
-          <w:rFonts w:ascii="Arial" w:hAnsi="Arial" w:cs="Arial"/>
-          <w:color w:val="222222"/>
-          <w:sz w:val="23"/>
-          <w:szCs w:val="23"/>
-          <w:shd w:val="clear" w:color="auto" w:fill="F9F9F9"/>
-          <w:lang w:val="lv-LV"/>
-        </w:rPr>
-        <w:t>konroliera</w:t>
-      </w:r>
-      <w:proofErr w:type="spellEnd"/>
-      <w:r>
-        <w:rPr>
-          <w:rFonts w:ascii="Arial" w:hAnsi="Arial" w:cs="Arial"/>
-          <w:color w:val="222222"/>
-          <w:sz w:val="23"/>
-          <w:szCs w:val="23"/>
-          <w:shd w:val="clear" w:color="auto" w:fill="F9F9F9"/>
-          <w:lang w:val="lv-LV"/>
-        </w:rPr>
-        <w:t xml:space="preserve"> (</w:t>
-      </w:r>
-      <w:hyperlink r:id="rId9" w:history="1">
+        <w:t>freeRTOS uz konroliera (</w:t>
+      </w:r>
+      <w:hyperlink r:id="rId13" w:history="1">
         <w:r>
           <w:rPr>
             <w:rStyle w:val="Hyperlink"/>
@@ -2327,6 +1984,1486 @@
           <w:lang w:val="lv-LV"/>
         </w:rPr>
         <w:t xml:space="preserve"> )</w:t>
+      </w:r>
+    </w:p>
+    <w:tbl>
+      <w:tblPr>
+        <w:tblStyle w:val="TableGrid"/>
+        <w:tblW w:w="0" w:type="auto"/>
+        <w:tblInd w:w="720" w:type="dxa"/>
+        <w:tblLook w:val="04A0" w:firstRow="1" w:lastRow="0" w:firstColumn="1" w:lastColumn="0" w:noHBand="0" w:noVBand="1"/>
+      </w:tblPr>
+      <w:tblGrid>
+        <w:gridCol w:w="2536"/>
+        <w:gridCol w:w="850"/>
+        <w:gridCol w:w="851"/>
+        <w:gridCol w:w="830"/>
+        <w:gridCol w:w="1154"/>
+        <w:gridCol w:w="1554"/>
+      </w:tblGrid>
+      <w:tr>
+        <w:tc>
+          <w:tcPr>
+            <w:tcW w:w="2536" w:type="dxa"/>
+          </w:tcPr>
+          <w:p>
+            <w:pPr>
+              <w:pStyle w:val="ListParagraph"/>
+              <w:spacing w:line="259" w:lineRule="auto"/>
+              <w:ind w:left="0"/>
+              <w:rPr>
+                <w:lang w:val="lv-LV"/>
+              </w:rPr>
+            </w:pPr>
+          </w:p>
+        </w:tc>
+        <w:tc>
+          <w:tcPr>
+            <w:tcW w:w="850" w:type="dxa"/>
+          </w:tcPr>
+          <w:p>
+            <w:pPr>
+              <w:pStyle w:val="ListParagraph"/>
+              <w:spacing w:line="259" w:lineRule="auto"/>
+              <w:ind w:left="0"/>
+              <w:rPr>
+                <w:lang w:val="lv-LV"/>
+              </w:rPr>
+            </w:pPr>
+            <w:r>
+              <w:rPr>
+                <w:lang w:val="lv-LV"/>
+              </w:rPr>
+              <w:t>1</w:t>
+            </w:r>
+          </w:p>
+        </w:tc>
+        <w:tc>
+          <w:tcPr>
+            <w:tcW w:w="851" w:type="dxa"/>
+          </w:tcPr>
+          <w:p>
+            <w:pPr>
+              <w:pStyle w:val="ListParagraph"/>
+              <w:spacing w:line="259" w:lineRule="auto"/>
+              <w:ind w:left="0"/>
+              <w:rPr>
+                <w:lang w:val="lv-LV"/>
+              </w:rPr>
+            </w:pPr>
+            <w:r>
+              <w:rPr>
+                <w:lang w:val="lv-LV"/>
+              </w:rPr>
+              <w:t>2</w:t>
+            </w:r>
+          </w:p>
+        </w:tc>
+        <w:tc>
+          <w:tcPr>
+            <w:tcW w:w="830" w:type="dxa"/>
+          </w:tcPr>
+          <w:p>
+            <w:pPr>
+              <w:pStyle w:val="ListParagraph"/>
+              <w:spacing w:line="259" w:lineRule="auto"/>
+              <w:ind w:left="0"/>
+              <w:rPr>
+                <w:lang w:val="lv-LV"/>
+              </w:rPr>
+            </w:pPr>
+            <w:r>
+              <w:rPr>
+                <w:lang w:val="lv-LV"/>
+              </w:rPr>
+              <w:t>3</w:t>
+            </w:r>
+          </w:p>
+        </w:tc>
+        <w:tc>
+          <w:tcPr>
+            <w:tcW w:w="1154" w:type="dxa"/>
+          </w:tcPr>
+          <w:p>
+            <w:pPr>
+              <w:pStyle w:val="ListParagraph"/>
+              <w:spacing w:line="259" w:lineRule="auto"/>
+              <w:ind w:left="0"/>
+              <w:rPr>
+                <w:lang w:val="lv-LV"/>
+              </w:rPr>
+            </w:pPr>
+            <w:r>
+              <w:rPr>
+                <w:lang w:val="lv-LV"/>
+              </w:rPr>
+              <w:t>4</w:t>
+            </w:r>
+          </w:p>
+        </w:tc>
+        <w:tc>
+          <w:tcPr>
+            <w:tcW w:w="1554" w:type="dxa"/>
+          </w:tcPr>
+          <w:p>
+            <w:pPr>
+              <w:pStyle w:val="ListParagraph"/>
+              <w:spacing w:line="259" w:lineRule="auto"/>
+              <w:ind w:left="0"/>
+              <w:rPr>
+                <w:lang w:val="lv-LV"/>
+              </w:rPr>
+            </w:pPr>
+            <w:r>
+              <w:rPr>
+                <w:lang w:val="lv-LV"/>
+              </w:rPr>
+              <w:t>5</w:t>
+            </w:r>
+          </w:p>
+        </w:tc>
+      </w:tr>
+      <w:tr>
+        <w:tc>
+          <w:tcPr>
+            <w:tcW w:w="2536" w:type="dxa"/>
+          </w:tcPr>
+          <w:p>
+            <w:pPr>
+              <w:pStyle w:val="ListParagraph"/>
+              <w:spacing w:line="259" w:lineRule="auto"/>
+              <w:ind w:left="0"/>
+              <w:rPr>
+                <w:lang w:val="lv-LV"/>
+              </w:rPr>
+            </w:pPr>
+            <w:r>
+              <w:rPr>
+                <w:lang w:val="lv-LV"/>
+              </w:rPr>
+              <w:t>CO2</w:t>
+            </w:r>
+          </w:p>
+        </w:tc>
+        <w:tc>
+          <w:tcPr>
+            <w:tcW w:w="850" w:type="dxa"/>
+          </w:tcPr>
+          <w:p>
+            <w:pPr>
+              <w:pStyle w:val="ListParagraph"/>
+              <w:spacing w:line="259" w:lineRule="auto"/>
+              <w:ind w:left="0"/>
+              <w:rPr>
+                <w:lang w:val="lv-LV"/>
+              </w:rPr>
+            </w:pPr>
+            <w:r>
+              <w:rPr>
+                <w:lang w:val="lv-LV"/>
+              </w:rPr>
+              <w:t>+</w:t>
+            </w:r>
+          </w:p>
+        </w:tc>
+        <w:tc>
+          <w:tcPr>
+            <w:tcW w:w="851" w:type="dxa"/>
+          </w:tcPr>
+          <w:p>
+            <w:pPr>
+              <w:pStyle w:val="ListParagraph"/>
+              <w:spacing w:line="259" w:lineRule="auto"/>
+              <w:ind w:left="0"/>
+              <w:rPr>
+                <w:lang w:val="lv-LV"/>
+              </w:rPr>
+            </w:pPr>
+            <w:r>
+              <w:rPr>
+                <w:lang w:val="lv-LV"/>
+              </w:rPr>
+              <w:t>+</w:t>
+            </w:r>
+          </w:p>
+        </w:tc>
+        <w:tc>
+          <w:tcPr>
+            <w:tcW w:w="830" w:type="dxa"/>
+          </w:tcPr>
+          <w:p>
+            <w:pPr>
+              <w:pStyle w:val="ListParagraph"/>
+              <w:spacing w:line="259" w:lineRule="auto"/>
+              <w:ind w:left="0"/>
+              <w:rPr>
+                <w:lang w:val="lv-LV"/>
+              </w:rPr>
+            </w:pPr>
+            <w:r>
+              <w:rPr>
+                <w:lang w:val="lv-LV"/>
+              </w:rPr>
+              <w:t>+</w:t>
+            </w:r>
+          </w:p>
+        </w:tc>
+        <w:tc>
+          <w:tcPr>
+            <w:tcW w:w="1154" w:type="dxa"/>
+          </w:tcPr>
+          <w:p>
+            <w:pPr>
+              <w:pStyle w:val="ListParagraph"/>
+              <w:spacing w:line="259" w:lineRule="auto"/>
+              <w:ind w:left="0"/>
+              <w:rPr>
+                <w:lang w:val="lv-LV"/>
+              </w:rPr>
+            </w:pPr>
+            <w:r>
+              <w:rPr>
+                <w:lang w:val="lv-LV"/>
+              </w:rPr>
+              <w:t>+</w:t>
+            </w:r>
+          </w:p>
+        </w:tc>
+        <w:tc>
+          <w:tcPr>
+            <w:tcW w:w="1554" w:type="dxa"/>
+          </w:tcPr>
+          <w:p>
+            <w:pPr>
+              <w:pStyle w:val="ListParagraph"/>
+              <w:spacing w:line="259" w:lineRule="auto"/>
+              <w:ind w:left="0"/>
+              <w:rPr>
+                <w:lang w:val="lv-LV"/>
+              </w:rPr>
+            </w:pPr>
+            <w:r>
+              <w:rPr>
+                <w:lang w:val="lv-LV"/>
+              </w:rPr>
+              <w:t>+</w:t>
+            </w:r>
+          </w:p>
+        </w:tc>
+      </w:tr>
+      <w:tr>
+        <w:tc>
+          <w:tcPr>
+            <w:tcW w:w="2536" w:type="dxa"/>
+          </w:tcPr>
+          <w:p>
+            <w:pPr>
+              <w:pStyle w:val="ListParagraph"/>
+              <w:spacing w:line="259" w:lineRule="auto"/>
+              <w:ind w:left="0"/>
+              <w:rPr>
+                <w:lang w:val="lv-LV"/>
+              </w:rPr>
+            </w:pPr>
+            <w:r>
+              <w:rPr>
+                <w:lang w:val="lv-LV"/>
+              </w:rPr>
+              <w:t>Temp</w:t>
+            </w:r>
+          </w:p>
+        </w:tc>
+        <w:tc>
+          <w:tcPr>
+            <w:tcW w:w="850" w:type="dxa"/>
+          </w:tcPr>
+          <w:p>
+            <w:pPr>
+              <w:pStyle w:val="ListParagraph"/>
+              <w:spacing w:line="259" w:lineRule="auto"/>
+              <w:ind w:left="0"/>
+              <w:rPr>
+                <w:lang w:val="lv-LV"/>
+              </w:rPr>
+            </w:pPr>
+            <w:r>
+              <w:rPr>
+                <w:lang w:val="lv-LV"/>
+              </w:rPr>
+              <w:t>+</w:t>
+            </w:r>
+          </w:p>
+        </w:tc>
+        <w:tc>
+          <w:tcPr>
+            <w:tcW w:w="851" w:type="dxa"/>
+          </w:tcPr>
+          <w:p>
+            <w:pPr>
+              <w:pStyle w:val="ListParagraph"/>
+              <w:spacing w:line="259" w:lineRule="auto"/>
+              <w:ind w:left="0"/>
+              <w:rPr>
+                <w:lang w:val="lv-LV"/>
+              </w:rPr>
+            </w:pPr>
+            <w:r>
+              <w:rPr>
+                <w:lang w:val="lv-LV"/>
+              </w:rPr>
+              <w:t>+</w:t>
+            </w:r>
+          </w:p>
+        </w:tc>
+        <w:tc>
+          <w:tcPr>
+            <w:tcW w:w="830" w:type="dxa"/>
+          </w:tcPr>
+          <w:p>
+            <w:pPr>
+              <w:pStyle w:val="ListParagraph"/>
+              <w:spacing w:line="259" w:lineRule="auto"/>
+              <w:ind w:left="0"/>
+              <w:rPr>
+                <w:lang w:val="lv-LV"/>
+              </w:rPr>
+            </w:pPr>
+            <w:r>
+              <w:rPr>
+                <w:lang w:val="lv-LV"/>
+              </w:rPr>
+              <w:t>+</w:t>
+            </w:r>
+          </w:p>
+        </w:tc>
+        <w:tc>
+          <w:tcPr>
+            <w:tcW w:w="1154" w:type="dxa"/>
+          </w:tcPr>
+          <w:p>
+            <w:pPr>
+              <w:pStyle w:val="ListParagraph"/>
+              <w:spacing w:line="259" w:lineRule="auto"/>
+              <w:ind w:left="0"/>
+              <w:rPr>
+                <w:lang w:val="lv-LV"/>
+              </w:rPr>
+            </w:pPr>
+            <w:r>
+              <w:rPr>
+                <w:lang w:val="lv-LV"/>
+              </w:rPr>
+              <w:t>+</w:t>
+            </w:r>
+          </w:p>
+        </w:tc>
+        <w:tc>
+          <w:tcPr>
+            <w:tcW w:w="1554" w:type="dxa"/>
+          </w:tcPr>
+          <w:p>
+            <w:pPr>
+              <w:pStyle w:val="ListParagraph"/>
+              <w:spacing w:line="259" w:lineRule="auto"/>
+              <w:ind w:left="0"/>
+              <w:rPr>
+                <w:lang w:val="lv-LV"/>
+              </w:rPr>
+            </w:pPr>
+            <w:r>
+              <w:rPr>
+                <w:lang w:val="lv-LV"/>
+              </w:rPr>
+              <w:t>+</w:t>
+            </w:r>
+          </w:p>
+        </w:tc>
+      </w:tr>
+      <w:tr>
+        <w:tc>
+          <w:tcPr>
+            <w:tcW w:w="2536" w:type="dxa"/>
+          </w:tcPr>
+          <w:p>
+            <w:pPr>
+              <w:pStyle w:val="ListParagraph"/>
+              <w:spacing w:line="259" w:lineRule="auto"/>
+              <w:ind w:left="0"/>
+              <w:rPr>
+                <w:lang w:val="lv-LV"/>
+              </w:rPr>
+            </w:pPr>
+            <w:r>
+              <w:rPr>
+                <w:lang w:val="lv-LV"/>
+              </w:rPr>
+              <w:t>Mitrums</w:t>
+            </w:r>
+          </w:p>
+        </w:tc>
+        <w:tc>
+          <w:tcPr>
+            <w:tcW w:w="850" w:type="dxa"/>
+          </w:tcPr>
+          <w:p>
+            <w:pPr>
+              <w:pStyle w:val="ListParagraph"/>
+              <w:spacing w:line="259" w:lineRule="auto"/>
+              <w:ind w:left="0"/>
+              <w:rPr>
+                <w:lang w:val="lv-LV"/>
+              </w:rPr>
+            </w:pPr>
+            <w:r>
+              <w:rPr>
+                <w:lang w:val="lv-LV"/>
+              </w:rPr>
+              <w:t>+</w:t>
+            </w:r>
+          </w:p>
+        </w:tc>
+        <w:tc>
+          <w:tcPr>
+            <w:tcW w:w="851" w:type="dxa"/>
+          </w:tcPr>
+          <w:p>
+            <w:pPr>
+              <w:pStyle w:val="ListParagraph"/>
+              <w:spacing w:line="259" w:lineRule="auto"/>
+              <w:ind w:left="0"/>
+              <w:rPr>
+                <w:lang w:val="lv-LV"/>
+              </w:rPr>
+            </w:pPr>
+            <w:r>
+              <w:rPr>
+                <w:lang w:val="lv-LV"/>
+              </w:rPr>
+              <w:t>+</w:t>
+            </w:r>
+          </w:p>
+        </w:tc>
+        <w:tc>
+          <w:tcPr>
+            <w:tcW w:w="830" w:type="dxa"/>
+          </w:tcPr>
+          <w:p>
+            <w:pPr>
+              <w:pStyle w:val="ListParagraph"/>
+              <w:spacing w:line="259" w:lineRule="auto"/>
+              <w:ind w:left="0"/>
+              <w:rPr>
+                <w:lang w:val="lv-LV"/>
+              </w:rPr>
+            </w:pPr>
+            <w:r>
+              <w:rPr>
+                <w:lang w:val="lv-LV"/>
+              </w:rPr>
+              <w:t>+</w:t>
+            </w:r>
+          </w:p>
+        </w:tc>
+        <w:tc>
+          <w:tcPr>
+            <w:tcW w:w="1154" w:type="dxa"/>
+          </w:tcPr>
+          <w:p>
+            <w:pPr>
+              <w:pStyle w:val="ListParagraph"/>
+              <w:spacing w:line="259" w:lineRule="auto"/>
+              <w:ind w:left="0"/>
+              <w:rPr>
+                <w:lang w:val="lv-LV"/>
+              </w:rPr>
+            </w:pPr>
+            <w:r>
+              <w:rPr>
+                <w:lang w:val="lv-LV"/>
+              </w:rPr>
+              <w:t>+</w:t>
+            </w:r>
+          </w:p>
+        </w:tc>
+        <w:tc>
+          <w:tcPr>
+            <w:tcW w:w="1554" w:type="dxa"/>
+          </w:tcPr>
+          <w:p>
+            <w:pPr>
+              <w:pStyle w:val="ListParagraph"/>
+              <w:spacing w:line="259" w:lineRule="auto"/>
+              <w:ind w:left="0"/>
+              <w:rPr>
+                <w:lang w:val="lv-LV"/>
+              </w:rPr>
+            </w:pPr>
+            <w:r>
+              <w:rPr>
+                <w:lang w:val="lv-LV"/>
+              </w:rPr>
+              <w:t>+</w:t>
+            </w:r>
+          </w:p>
+        </w:tc>
+      </w:tr>
+      <w:tr>
+        <w:tc>
+          <w:tcPr>
+            <w:tcW w:w="2536" w:type="dxa"/>
+          </w:tcPr>
+          <w:p>
+            <w:pPr>
+              <w:pStyle w:val="ListParagraph"/>
+              <w:spacing w:line="259" w:lineRule="auto"/>
+              <w:ind w:left="0"/>
+              <w:rPr>
+                <w:lang w:val="lv-LV"/>
+              </w:rPr>
+            </w:pPr>
+            <w:r>
+              <w:rPr>
+                <w:lang w:val="lv-LV"/>
+              </w:rPr>
+              <w:t>WiFi</w:t>
+            </w:r>
+          </w:p>
+        </w:tc>
+        <w:tc>
+          <w:tcPr>
+            <w:tcW w:w="850" w:type="dxa"/>
+          </w:tcPr>
+          <w:p>
+            <w:pPr>
+              <w:pStyle w:val="ListParagraph"/>
+              <w:spacing w:line="259" w:lineRule="auto"/>
+              <w:ind w:left="0"/>
+              <w:rPr>
+                <w:lang w:val="lv-LV"/>
+              </w:rPr>
+            </w:pPr>
+            <w:r>
+              <w:rPr>
+                <w:lang w:val="lv-LV"/>
+              </w:rPr>
+              <w:t>+</w:t>
+            </w:r>
+          </w:p>
+        </w:tc>
+        <w:tc>
+          <w:tcPr>
+            <w:tcW w:w="851" w:type="dxa"/>
+          </w:tcPr>
+          <w:p>
+            <w:pPr>
+              <w:pStyle w:val="ListParagraph"/>
+              <w:spacing w:line="259" w:lineRule="auto"/>
+              <w:ind w:left="0"/>
+              <w:rPr>
+                <w:lang w:val="lv-LV"/>
+              </w:rPr>
+            </w:pPr>
+            <w:r>
+              <w:rPr>
+                <w:lang w:val="lv-LV"/>
+              </w:rPr>
+              <w:t>+</w:t>
+            </w:r>
+          </w:p>
+        </w:tc>
+        <w:tc>
+          <w:tcPr>
+            <w:tcW w:w="830" w:type="dxa"/>
+          </w:tcPr>
+          <w:p>
+            <w:pPr>
+              <w:pStyle w:val="ListParagraph"/>
+              <w:spacing w:line="259" w:lineRule="auto"/>
+              <w:ind w:left="0"/>
+              <w:rPr>
+                <w:lang w:val="lv-LV"/>
+              </w:rPr>
+            </w:pPr>
+            <w:r>
+              <w:rPr>
+                <w:lang w:val="lv-LV"/>
+              </w:rPr>
+              <w:t>+</w:t>
+            </w:r>
+          </w:p>
+        </w:tc>
+        <w:tc>
+          <w:tcPr>
+            <w:tcW w:w="1154" w:type="dxa"/>
+          </w:tcPr>
+          <w:p>
+            <w:pPr>
+              <w:pStyle w:val="ListParagraph"/>
+              <w:spacing w:line="259" w:lineRule="auto"/>
+              <w:ind w:left="0"/>
+              <w:rPr>
+                <w:lang w:val="lv-LV"/>
+              </w:rPr>
+            </w:pPr>
+            <w:r>
+              <w:rPr>
+                <w:lang w:val="lv-LV"/>
+              </w:rPr>
+              <w:t>-/868Mhz</w:t>
+            </w:r>
+          </w:p>
+        </w:tc>
+        <w:tc>
+          <w:tcPr>
+            <w:tcW w:w="1554" w:type="dxa"/>
+          </w:tcPr>
+          <w:p>
+            <w:pPr>
+              <w:pStyle w:val="ListParagraph"/>
+              <w:spacing w:line="259" w:lineRule="auto"/>
+              <w:ind w:left="0"/>
+              <w:rPr>
+                <w:lang w:val="lv-LV"/>
+              </w:rPr>
+            </w:pPr>
+            <w:r>
+              <w:rPr>
+                <w:lang w:val="lv-LV"/>
+              </w:rPr>
+              <w:t>+</w:t>
+            </w:r>
+          </w:p>
+        </w:tc>
+      </w:tr>
+      <w:tr>
+        <w:tc>
+          <w:tcPr>
+            <w:tcW w:w="2536" w:type="dxa"/>
+          </w:tcPr>
+          <w:p>
+            <w:pPr>
+              <w:pStyle w:val="ListParagraph"/>
+              <w:spacing w:line="259" w:lineRule="auto"/>
+              <w:ind w:left="0"/>
+              <w:rPr>
+                <w:lang w:val="lv-LV"/>
+              </w:rPr>
+            </w:pPr>
+            <w:r>
+              <w:rPr>
+                <w:lang w:val="lv-LV"/>
+              </w:rPr>
+              <w:t>Pieejams vieglās valodas</w:t>
+            </w:r>
+            <w:r>
+              <w:rPr>
+                <w:lang w:val="lv-LV"/>
+              </w:rPr>
+              <w:t xml:space="preserve"> datu novērtējums</w:t>
+            </w:r>
+          </w:p>
+        </w:tc>
+        <w:tc>
+          <w:tcPr>
+            <w:tcW w:w="850" w:type="dxa"/>
+          </w:tcPr>
+          <w:p>
+            <w:pPr>
+              <w:pStyle w:val="ListParagraph"/>
+              <w:spacing w:line="259" w:lineRule="auto"/>
+              <w:ind w:left="0"/>
+              <w:rPr>
+                <w:lang w:val="lv-LV"/>
+              </w:rPr>
+            </w:pPr>
+            <w:r>
+              <w:rPr>
+                <w:lang w:val="lv-LV"/>
+              </w:rPr>
+              <w:t>+</w:t>
+            </w:r>
+          </w:p>
+        </w:tc>
+        <w:tc>
+          <w:tcPr>
+            <w:tcW w:w="851" w:type="dxa"/>
+          </w:tcPr>
+          <w:p>
+            <w:pPr>
+              <w:pStyle w:val="ListParagraph"/>
+              <w:spacing w:line="259" w:lineRule="auto"/>
+              <w:ind w:left="0"/>
+              <w:rPr>
+                <w:lang w:val="lv-LV"/>
+              </w:rPr>
+            </w:pPr>
+            <w:r>
+              <w:rPr>
+                <w:lang w:val="lv-LV"/>
+              </w:rPr>
+              <w:t>+</w:t>
+            </w:r>
+          </w:p>
+        </w:tc>
+        <w:tc>
+          <w:tcPr>
+            <w:tcW w:w="830" w:type="dxa"/>
+          </w:tcPr>
+          <w:p>
+            <w:pPr>
+              <w:pStyle w:val="ListParagraph"/>
+              <w:spacing w:line="259" w:lineRule="auto"/>
+              <w:ind w:left="0"/>
+              <w:rPr>
+                <w:lang w:val="lv-LV"/>
+              </w:rPr>
+            </w:pPr>
+            <w:r>
+              <w:rPr>
+                <w:lang w:val="lv-LV"/>
+              </w:rPr>
+              <w:t>+</w:t>
+            </w:r>
+          </w:p>
+        </w:tc>
+        <w:tc>
+          <w:tcPr>
+            <w:tcW w:w="1154" w:type="dxa"/>
+          </w:tcPr>
+          <w:p>
+            <w:pPr>
+              <w:pStyle w:val="ListParagraph"/>
+              <w:spacing w:line="259" w:lineRule="auto"/>
+              <w:ind w:left="0"/>
+              <w:rPr>
+                <w:lang w:val="lv-LV"/>
+              </w:rPr>
+            </w:pPr>
+            <w:r>
+              <w:rPr>
+                <w:lang w:val="lv-LV"/>
+              </w:rPr>
+              <w:t>+</w:t>
+            </w:r>
+          </w:p>
+        </w:tc>
+        <w:tc>
+          <w:tcPr>
+            <w:tcW w:w="1554" w:type="dxa"/>
+          </w:tcPr>
+          <w:p>
+            <w:pPr>
+              <w:pStyle w:val="ListParagraph"/>
+              <w:spacing w:line="259" w:lineRule="auto"/>
+              <w:ind w:left="0"/>
+              <w:rPr>
+                <w:lang w:val="lv-LV"/>
+              </w:rPr>
+            </w:pPr>
+            <w:r>
+              <w:rPr>
+                <w:lang w:val="lv-LV"/>
+              </w:rPr>
+              <w:t>+/-</w:t>
+            </w:r>
+          </w:p>
+        </w:tc>
+      </w:tr>
+      <w:tr>
+        <w:tc>
+          <w:tcPr>
+            <w:tcW w:w="2536" w:type="dxa"/>
+          </w:tcPr>
+          <w:p>
+            <w:pPr>
+              <w:pStyle w:val="ListParagraph"/>
+              <w:spacing w:line="259" w:lineRule="auto"/>
+              <w:ind w:left="0"/>
+              <w:rPr>
+                <w:lang w:val="lv-LV"/>
+              </w:rPr>
+            </w:pPr>
+            <w:r>
+              <w:rPr>
+                <w:lang w:val="lv-LV"/>
+              </w:rPr>
+              <w:t>Mērījumu vēsture</w:t>
+            </w:r>
+          </w:p>
+        </w:tc>
+        <w:tc>
+          <w:tcPr>
+            <w:tcW w:w="850" w:type="dxa"/>
+          </w:tcPr>
+          <w:p>
+            <w:pPr>
+              <w:pStyle w:val="ListParagraph"/>
+              <w:spacing w:line="259" w:lineRule="auto"/>
+              <w:ind w:left="0"/>
+              <w:rPr>
+                <w:lang w:val="lv-LV"/>
+              </w:rPr>
+            </w:pPr>
+            <w:r>
+              <w:rPr>
+                <w:lang w:val="lv-LV"/>
+              </w:rPr>
+              <w:t>+/-</w:t>
+            </w:r>
+          </w:p>
+        </w:tc>
+        <w:tc>
+          <w:tcPr>
+            <w:tcW w:w="851" w:type="dxa"/>
+          </w:tcPr>
+          <w:p>
+            <w:pPr>
+              <w:pStyle w:val="ListParagraph"/>
+              <w:spacing w:line="259" w:lineRule="auto"/>
+              <w:ind w:left="0"/>
+              <w:rPr>
+                <w:lang w:val="lv-LV"/>
+              </w:rPr>
+            </w:pPr>
+            <w:r>
+              <w:rPr>
+                <w:lang w:val="lv-LV"/>
+              </w:rPr>
+              <w:t>-</w:t>
+            </w:r>
+          </w:p>
+        </w:tc>
+        <w:tc>
+          <w:tcPr>
+            <w:tcW w:w="830" w:type="dxa"/>
+          </w:tcPr>
+          <w:p>
+            <w:pPr>
+              <w:pStyle w:val="ListParagraph"/>
+              <w:spacing w:line="259" w:lineRule="auto"/>
+              <w:ind w:left="0"/>
+              <w:rPr>
+                <w:lang w:val="lv-LV"/>
+              </w:rPr>
+            </w:pPr>
+            <w:r>
+              <w:rPr>
+                <w:lang w:val="lv-LV"/>
+              </w:rPr>
+              <w:t>+/-</w:t>
+            </w:r>
+          </w:p>
+        </w:tc>
+        <w:tc>
+          <w:tcPr>
+            <w:tcW w:w="1154" w:type="dxa"/>
+          </w:tcPr>
+          <w:p>
+            <w:pPr>
+              <w:pStyle w:val="ListParagraph"/>
+              <w:spacing w:line="259" w:lineRule="auto"/>
+              <w:ind w:left="0"/>
+              <w:rPr>
+                <w:lang w:val="lv-LV"/>
+              </w:rPr>
+            </w:pPr>
+            <w:r>
+              <w:rPr>
+                <w:lang w:val="lv-LV"/>
+              </w:rPr>
+              <w:t>+</w:t>
+            </w:r>
+          </w:p>
+        </w:tc>
+        <w:tc>
+          <w:tcPr>
+            <w:tcW w:w="1554" w:type="dxa"/>
+          </w:tcPr>
+          <w:p>
+            <w:pPr>
+              <w:pStyle w:val="ListParagraph"/>
+              <w:spacing w:line="259" w:lineRule="auto"/>
+              <w:ind w:left="0"/>
+              <w:rPr>
+                <w:lang w:val="lv-LV"/>
+              </w:rPr>
+            </w:pPr>
+            <w:r>
+              <w:rPr>
+                <w:lang w:val="lv-LV"/>
+              </w:rPr>
+              <w:t>-</w:t>
+            </w:r>
+          </w:p>
+        </w:tc>
+      </w:tr>
+      <w:tr>
+        <w:tc>
+          <w:tcPr>
+            <w:tcW w:w="2536" w:type="dxa"/>
+          </w:tcPr>
+          <w:p>
+            <w:pPr>
+              <w:pStyle w:val="ListParagraph"/>
+              <w:spacing w:line="259" w:lineRule="auto"/>
+              <w:ind w:left="0"/>
+              <w:rPr>
+                <w:lang w:val="lv-LV"/>
+              </w:rPr>
+            </w:pPr>
+            <w:r>
+              <w:rPr>
+                <w:lang w:val="lv-LV"/>
+              </w:rPr>
+              <w:t>Iespēja arhivēt datus</w:t>
+            </w:r>
+          </w:p>
+        </w:tc>
+        <w:tc>
+          <w:tcPr>
+            <w:tcW w:w="850" w:type="dxa"/>
+          </w:tcPr>
+          <w:p>
+            <w:pPr>
+              <w:pStyle w:val="ListParagraph"/>
+              <w:spacing w:line="259" w:lineRule="auto"/>
+              <w:ind w:left="0"/>
+              <w:rPr>
+                <w:lang w:val="lv-LV"/>
+              </w:rPr>
+            </w:pPr>
+            <w:r>
+              <w:rPr>
+                <w:lang w:val="lv-LV"/>
+              </w:rPr>
+              <w:t>-</w:t>
+            </w:r>
+          </w:p>
+        </w:tc>
+        <w:tc>
+          <w:tcPr>
+            <w:tcW w:w="851" w:type="dxa"/>
+          </w:tcPr>
+          <w:p>
+            <w:pPr>
+              <w:pStyle w:val="ListParagraph"/>
+              <w:spacing w:line="259" w:lineRule="auto"/>
+              <w:ind w:left="0"/>
+              <w:rPr>
+                <w:lang w:val="lv-LV"/>
+              </w:rPr>
+            </w:pPr>
+            <w:r>
+              <w:rPr>
+                <w:lang w:val="lv-LV"/>
+              </w:rPr>
+              <w:t>-</w:t>
+            </w:r>
+          </w:p>
+        </w:tc>
+        <w:tc>
+          <w:tcPr>
+            <w:tcW w:w="830" w:type="dxa"/>
+          </w:tcPr>
+          <w:p>
+            <w:pPr>
+              <w:pStyle w:val="ListParagraph"/>
+              <w:spacing w:line="259" w:lineRule="auto"/>
+              <w:ind w:left="0"/>
+              <w:rPr>
+                <w:lang w:val="lv-LV"/>
+              </w:rPr>
+            </w:pPr>
+            <w:r>
+              <w:rPr>
+                <w:lang w:val="lv-LV"/>
+              </w:rPr>
+              <w:t>-</w:t>
+            </w:r>
+          </w:p>
+        </w:tc>
+        <w:tc>
+          <w:tcPr>
+            <w:tcW w:w="1154" w:type="dxa"/>
+          </w:tcPr>
+          <w:p>
+            <w:pPr>
+              <w:pStyle w:val="ListParagraph"/>
+              <w:spacing w:line="259" w:lineRule="auto"/>
+              <w:ind w:left="0"/>
+              <w:rPr>
+                <w:lang w:val="lv-LV"/>
+              </w:rPr>
+            </w:pPr>
+            <w:r>
+              <w:rPr>
+                <w:lang w:val="lv-LV"/>
+              </w:rPr>
+              <w:t>-</w:t>
+            </w:r>
+          </w:p>
+        </w:tc>
+        <w:tc>
+          <w:tcPr>
+            <w:tcW w:w="1554" w:type="dxa"/>
+          </w:tcPr>
+          <w:p>
+            <w:pPr>
+              <w:pStyle w:val="ListParagraph"/>
+              <w:spacing w:line="259" w:lineRule="auto"/>
+              <w:ind w:left="0"/>
+              <w:rPr>
+                <w:lang w:val="lv-LV"/>
+              </w:rPr>
+            </w:pPr>
+            <w:r>
+              <w:rPr>
+                <w:lang w:val="lv-LV"/>
+              </w:rPr>
+              <w:t>-</w:t>
+            </w:r>
+          </w:p>
+        </w:tc>
+      </w:tr>
+      <w:tr>
+        <w:tc>
+          <w:tcPr>
+            <w:tcW w:w="2536" w:type="dxa"/>
+          </w:tcPr>
+          <w:p>
+            <w:pPr>
+              <w:pStyle w:val="ListParagraph"/>
+              <w:spacing w:line="259" w:lineRule="auto"/>
+              <w:ind w:left="0"/>
+              <w:rPr>
+                <w:lang w:val="lv-LV"/>
+              </w:rPr>
+            </w:pPr>
+            <w:r>
+              <w:rPr>
+                <w:lang w:val="lv-LV"/>
+              </w:rPr>
+              <w:t>Iespēja regulēt biežumu</w:t>
+            </w:r>
+          </w:p>
+        </w:tc>
+        <w:tc>
+          <w:tcPr>
+            <w:tcW w:w="850" w:type="dxa"/>
+          </w:tcPr>
+          <w:p>
+            <w:pPr>
+              <w:pStyle w:val="ListParagraph"/>
+              <w:spacing w:line="259" w:lineRule="auto"/>
+              <w:ind w:left="0"/>
+              <w:rPr>
+                <w:lang w:val="lv-LV"/>
+              </w:rPr>
+            </w:pPr>
+            <w:r>
+              <w:rPr>
+                <w:lang w:val="lv-LV"/>
+              </w:rPr>
+              <w:t>-</w:t>
+            </w:r>
+          </w:p>
+        </w:tc>
+        <w:tc>
+          <w:tcPr>
+            <w:tcW w:w="851" w:type="dxa"/>
+          </w:tcPr>
+          <w:p>
+            <w:pPr>
+              <w:pStyle w:val="ListParagraph"/>
+              <w:spacing w:line="259" w:lineRule="auto"/>
+              <w:ind w:left="0"/>
+              <w:rPr>
+                <w:lang w:val="lv-LV"/>
+              </w:rPr>
+            </w:pPr>
+            <w:r>
+              <w:rPr>
+                <w:lang w:val="lv-LV"/>
+              </w:rPr>
+              <w:t>-</w:t>
+            </w:r>
+          </w:p>
+        </w:tc>
+        <w:tc>
+          <w:tcPr>
+            <w:tcW w:w="830" w:type="dxa"/>
+          </w:tcPr>
+          <w:p>
+            <w:pPr>
+              <w:pStyle w:val="ListParagraph"/>
+              <w:spacing w:line="259" w:lineRule="auto"/>
+              <w:ind w:left="0"/>
+              <w:rPr>
+                <w:lang w:val="lv-LV"/>
+              </w:rPr>
+            </w:pPr>
+            <w:r>
+              <w:rPr>
+                <w:lang w:val="lv-LV"/>
+              </w:rPr>
+              <w:t>-</w:t>
+            </w:r>
+          </w:p>
+        </w:tc>
+        <w:tc>
+          <w:tcPr>
+            <w:tcW w:w="1154" w:type="dxa"/>
+          </w:tcPr>
+          <w:p>
+            <w:pPr>
+              <w:pStyle w:val="ListParagraph"/>
+              <w:spacing w:line="259" w:lineRule="auto"/>
+              <w:ind w:left="0"/>
+              <w:rPr>
+                <w:lang w:val="lv-LV"/>
+              </w:rPr>
+            </w:pPr>
+            <w:r>
+              <w:rPr>
+                <w:lang w:val="lv-LV"/>
+              </w:rPr>
+              <w:t>+</w:t>
+            </w:r>
+          </w:p>
+        </w:tc>
+        <w:tc>
+          <w:tcPr>
+            <w:tcW w:w="1554" w:type="dxa"/>
+          </w:tcPr>
+          <w:p>
+            <w:pPr>
+              <w:pStyle w:val="ListParagraph"/>
+              <w:spacing w:line="259" w:lineRule="auto"/>
+              <w:ind w:left="0"/>
+              <w:rPr>
+                <w:lang w:val="lv-LV"/>
+              </w:rPr>
+            </w:pPr>
+            <w:r>
+              <w:rPr>
+                <w:lang w:val="lv-LV"/>
+              </w:rPr>
+              <w:t>-</w:t>
+            </w:r>
+          </w:p>
+        </w:tc>
+      </w:tr>
+      <w:tr>
+        <w:tc>
+          <w:tcPr>
+            <w:tcW w:w="2536" w:type="dxa"/>
+          </w:tcPr>
+          <w:p>
+            <w:pPr>
+              <w:pStyle w:val="ListParagraph"/>
+              <w:spacing w:line="259" w:lineRule="auto"/>
+              <w:ind w:left="0"/>
+              <w:rPr>
+                <w:lang w:val="lv-LV"/>
+              </w:rPr>
+            </w:pPr>
+            <w:r>
+              <w:rPr>
+                <w:lang w:val="lv-LV"/>
+              </w:rPr>
+              <w:t>Iespēja modificēt</w:t>
+            </w:r>
+          </w:p>
+        </w:tc>
+        <w:tc>
+          <w:tcPr>
+            <w:tcW w:w="850" w:type="dxa"/>
+          </w:tcPr>
+          <w:p>
+            <w:pPr>
+              <w:pStyle w:val="ListParagraph"/>
+              <w:spacing w:line="259" w:lineRule="auto"/>
+              <w:ind w:left="0"/>
+              <w:rPr>
+                <w:lang w:val="lv-LV"/>
+              </w:rPr>
+            </w:pPr>
+            <w:r>
+              <w:rPr>
+                <w:lang w:val="lv-LV"/>
+              </w:rPr>
+              <w:t>+/-</w:t>
+            </w:r>
+          </w:p>
+        </w:tc>
+        <w:tc>
+          <w:tcPr>
+            <w:tcW w:w="851" w:type="dxa"/>
+          </w:tcPr>
+          <w:p>
+            <w:pPr>
+              <w:pStyle w:val="ListParagraph"/>
+              <w:spacing w:line="259" w:lineRule="auto"/>
+              <w:ind w:left="0"/>
+              <w:rPr>
+                <w:lang w:val="lv-LV"/>
+              </w:rPr>
+            </w:pPr>
+            <w:r>
+              <w:rPr>
+                <w:lang w:val="lv-LV"/>
+              </w:rPr>
+              <w:t>-</w:t>
+            </w:r>
+          </w:p>
+        </w:tc>
+        <w:tc>
+          <w:tcPr>
+            <w:tcW w:w="830" w:type="dxa"/>
+          </w:tcPr>
+          <w:p>
+            <w:pPr>
+              <w:pStyle w:val="ListParagraph"/>
+              <w:spacing w:line="259" w:lineRule="auto"/>
+              <w:ind w:left="0"/>
+              <w:rPr>
+                <w:lang w:val="lv-LV"/>
+              </w:rPr>
+            </w:pPr>
+            <w:r>
+              <w:rPr>
+                <w:lang w:val="lv-LV"/>
+              </w:rPr>
+              <w:t>-</w:t>
+            </w:r>
+          </w:p>
+        </w:tc>
+        <w:tc>
+          <w:tcPr>
+            <w:tcW w:w="1154" w:type="dxa"/>
+          </w:tcPr>
+          <w:p>
+            <w:pPr>
+              <w:pStyle w:val="ListParagraph"/>
+              <w:spacing w:line="259" w:lineRule="auto"/>
+              <w:ind w:left="0"/>
+              <w:rPr>
+                <w:lang w:val="lv-LV"/>
+              </w:rPr>
+            </w:pPr>
+            <w:r>
+              <w:rPr>
+                <w:lang w:val="lv-LV"/>
+              </w:rPr>
+              <w:t>-</w:t>
+            </w:r>
+          </w:p>
+        </w:tc>
+        <w:tc>
+          <w:tcPr>
+            <w:tcW w:w="1554" w:type="dxa"/>
+          </w:tcPr>
+          <w:p>
+            <w:pPr>
+              <w:pStyle w:val="ListParagraph"/>
+              <w:spacing w:line="259" w:lineRule="auto"/>
+              <w:ind w:left="0"/>
+              <w:rPr>
+                <w:lang w:val="lv-LV"/>
+              </w:rPr>
+            </w:pPr>
+            <w:r>
+              <w:rPr>
+                <w:lang w:val="lv-LV"/>
+              </w:rPr>
+              <w:t>-</w:t>
+            </w:r>
+          </w:p>
+        </w:tc>
+      </w:tr>
+      <w:tr>
+        <w:tc>
+          <w:tcPr>
+            <w:tcW w:w="2536" w:type="dxa"/>
+          </w:tcPr>
+          <w:p>
+            <w:pPr>
+              <w:pStyle w:val="ListParagraph"/>
+              <w:spacing w:line="259" w:lineRule="auto"/>
+              <w:ind w:left="0"/>
+              <w:rPr>
+                <w:lang w:val="lv-LV"/>
+              </w:rPr>
+            </w:pPr>
+            <w:r>
+              <w:rPr>
+                <w:lang w:val="lv-LV"/>
+              </w:rPr>
+              <w:t>Cena (eur)  bez piegādes</w:t>
+            </w:r>
+          </w:p>
+        </w:tc>
+        <w:tc>
+          <w:tcPr>
+            <w:tcW w:w="850" w:type="dxa"/>
+          </w:tcPr>
+          <w:p>
+            <w:pPr>
+              <w:pStyle w:val="ListParagraph"/>
+              <w:spacing w:line="259" w:lineRule="auto"/>
+              <w:ind w:left="0"/>
+              <w:rPr>
+                <w:lang w:val="lv-LV"/>
+              </w:rPr>
+            </w:pPr>
+            <w:hyperlink r:id="rId14" w:history="1">
+              <w:r>
+                <w:rPr>
+                  <w:rStyle w:val="Hyperlink"/>
+                  <w:lang w:val="lv-LV"/>
+                </w:rPr>
+                <w:t>195,24</w:t>
+              </w:r>
+            </w:hyperlink>
+          </w:p>
+        </w:tc>
+        <w:tc>
+          <w:tcPr>
+            <w:tcW w:w="851" w:type="dxa"/>
+          </w:tcPr>
+          <w:p>
+            <w:pPr>
+              <w:pStyle w:val="ListParagraph"/>
+              <w:spacing w:line="259" w:lineRule="auto"/>
+              <w:ind w:left="0"/>
+              <w:rPr>
+                <w:lang w:val="lv-LV"/>
+              </w:rPr>
+            </w:pPr>
+            <w:hyperlink r:id="rId15" w:history="1">
+              <w:r>
+                <w:rPr>
+                  <w:rStyle w:val="Hyperlink"/>
+                  <w:lang w:val="lv-LV"/>
+                </w:rPr>
+                <w:t>5</w:t>
+              </w:r>
+              <w:r>
+                <w:rPr>
+                  <w:rStyle w:val="Hyperlink"/>
+                  <w:lang w:val="lv-LV"/>
+                </w:rPr>
+                <w:t>6.99</w:t>
+              </w:r>
+            </w:hyperlink>
+          </w:p>
+        </w:tc>
+        <w:tc>
+          <w:tcPr>
+            <w:tcW w:w="830" w:type="dxa"/>
+          </w:tcPr>
+          <w:p>
+            <w:pPr>
+              <w:pStyle w:val="ListParagraph"/>
+              <w:spacing w:line="259" w:lineRule="auto"/>
+              <w:ind w:left="0"/>
+              <w:rPr>
+                <w:lang w:val="lv-LV"/>
+              </w:rPr>
+            </w:pPr>
+            <w:hyperlink r:id="rId16" w:history="1">
+              <w:r>
+                <w:rPr>
+                  <w:rStyle w:val="Hyperlink"/>
+                  <w:lang w:val="lv-LV"/>
+                </w:rPr>
+                <w:t>149.00</w:t>
+              </w:r>
+            </w:hyperlink>
+          </w:p>
+        </w:tc>
+        <w:tc>
+          <w:tcPr>
+            <w:tcW w:w="1154" w:type="dxa"/>
+          </w:tcPr>
+          <w:p>
+            <w:pPr>
+              <w:pStyle w:val="ListParagraph"/>
+              <w:spacing w:line="259" w:lineRule="auto"/>
+              <w:ind w:left="0"/>
+              <w:rPr>
+                <w:lang w:val="lv-LV"/>
+              </w:rPr>
+            </w:pPr>
+            <w:hyperlink r:id="rId17" w:history="1">
+              <w:r>
+                <w:rPr>
+                  <w:rStyle w:val="Hyperlink"/>
+                  <w:lang w:val="lv-LV"/>
+                </w:rPr>
+                <w:t>669,00</w:t>
+              </w:r>
+            </w:hyperlink>
+            <w:r>
+              <w:rPr>
+                <w:lang w:val="lv-LV"/>
+              </w:rPr>
+              <w:t>*</w:t>
+            </w:r>
+          </w:p>
+        </w:tc>
+        <w:tc>
+          <w:tcPr>
+            <w:tcW w:w="1554" w:type="dxa"/>
+          </w:tcPr>
+          <w:p>
+            <w:pPr>
+              <w:pStyle w:val="ListParagraph"/>
+              <w:spacing w:line="259" w:lineRule="auto"/>
+              <w:ind w:left="0"/>
+              <w:rPr>
+                <w:lang w:val="lv-LV"/>
+              </w:rPr>
+            </w:pPr>
+            <w:hyperlink r:id="rId18" w:history="1">
+              <w:r>
+                <w:rPr>
+                  <w:rStyle w:val="Hyperlink"/>
+                  <w:lang w:val="lv-LV"/>
+                </w:rPr>
+                <w:t>77.70</w:t>
+              </w:r>
+            </w:hyperlink>
+          </w:p>
+        </w:tc>
+      </w:tr>
+    </w:tbl>
+    <w:p>
+      <w:pPr>
+        <w:spacing w:line="259" w:lineRule="auto"/>
+        <w:rPr>
+          <w:lang w:val="lv-LV"/>
+        </w:rPr>
+      </w:pPr>
+      <w:r>
+        <w:rPr>
+          <w:lang w:val="lv-LV"/>
+        </w:rPr>
+        <w:t>* ar piegādi</w:t>
+      </w:r>
+    </w:p>
+    <w:p>
+      <w:pPr>
+        <w:spacing w:line="259" w:lineRule="auto"/>
+        <w:rPr>
+          <w:lang w:val="lv-LV"/>
+        </w:rPr>
+      </w:pPr>
+      <w:r>
+        <w:rPr>
+          <w:lang w:val="lv-LV"/>
+        </w:rPr>
+        <w:t>+/- -samērā viegli pieejams, taču nepieciešama papildus aparatūra vai konfigurācija</w:t>
       </w:r>
       <w:r>
         <w:rPr>
@@ -2723,48 +3860,8 @@
                 <w:lang w:val="lv-LV" w:eastAsia="en-SE"/>
                 <w14:ligatures w14:val="none"/>
               </w:rPr>
-              <w:t xml:space="preserve">A-&gt; </w:t>
-            </w:r>
-            <w:proofErr w:type="spellStart"/>
-            <w:r>
-              <w:rPr>
-                <w:rFonts w:ascii="Segoe UI" w:eastAsia="Times New Roman" w:hAnsi="Segoe UI" w:cs="Segoe UI"/>
-                <w:color w:val="1F2328"/>
-                <w:kern w:val="0"/>
-                <w:sz w:val="24"/>
-                <w:szCs w:val="24"/>
-                <w:lang w:val="lv-LV" w:eastAsia="en-SE"/>
-                <w14:ligatures w14:val="none"/>
-              </w:rPr>
-              <w:t>Must</w:t>
-            </w:r>
-            <w:proofErr w:type="spellEnd"/>
-            <w:r>
-              <w:rPr>
-                <w:rFonts w:ascii="Segoe UI" w:eastAsia="Times New Roman" w:hAnsi="Segoe UI" w:cs="Segoe UI"/>
-                <w:color w:val="1F2328"/>
-                <w:kern w:val="0"/>
-                <w:sz w:val="24"/>
-                <w:szCs w:val="24"/>
-                <w:lang w:val="lv-LV" w:eastAsia="en-SE"/>
-                <w14:ligatures w14:val="none"/>
-              </w:rPr>
-              <w:t xml:space="preserve"> </w:t>
-            </w:r>
-            <w:proofErr w:type="spellStart"/>
-            <w:r>
-              <w:rPr>
-                <w:rFonts w:ascii="Segoe UI" w:eastAsia="Times New Roman" w:hAnsi="Segoe UI" w:cs="Segoe UI"/>
-                <w:color w:val="1F2328"/>
-                <w:kern w:val="0"/>
-                <w:sz w:val="24"/>
-                <w:szCs w:val="24"/>
-                <w:lang w:val="lv-LV" w:eastAsia="en-SE"/>
-                <w14:ligatures w14:val="none"/>
-              </w:rPr>
-              <w:t>haves</w:t>
-            </w:r>
-            <w:proofErr w:type="spellEnd"/>
+              <w:t>A-&gt; Must haves</w:t>
+            </w:r>
           </w:p>
         </w:tc>
         <w:tc>
@@ -2931,48 +4028,8 @@
                 <w:lang w:val="lv-LV" w:eastAsia="en-SE"/>
                 <w14:ligatures w14:val="none"/>
               </w:rPr>
-              <w:t xml:space="preserve">A-&gt; </w:t>
-            </w:r>
-            <w:proofErr w:type="spellStart"/>
-            <w:r>
-              <w:rPr>
-                <w:rFonts w:ascii="Segoe UI" w:eastAsia="Times New Roman" w:hAnsi="Segoe UI" w:cs="Segoe UI"/>
-                <w:color w:val="1F2328"/>
-                <w:kern w:val="0"/>
-                <w:sz w:val="24"/>
-                <w:szCs w:val="24"/>
-                <w:lang w:val="lv-LV" w:eastAsia="en-SE"/>
-                <w14:ligatures w14:val="none"/>
-              </w:rPr>
-              <w:t>Must</w:t>
-            </w:r>
-            <w:proofErr w:type="spellEnd"/>
-            <w:r>
-              <w:rPr>
-                <w:rFonts w:ascii="Segoe UI" w:eastAsia="Times New Roman" w:hAnsi="Segoe UI" w:cs="Segoe UI"/>
-                <w:color w:val="1F2328"/>
-                <w:kern w:val="0"/>
-                <w:sz w:val="24"/>
-                <w:szCs w:val="24"/>
-                <w:lang w:val="lv-LV" w:eastAsia="en-SE"/>
-                <w14:ligatures w14:val="none"/>
-              </w:rPr>
-              <w:t xml:space="preserve"> </w:t>
-            </w:r>
-            <w:proofErr w:type="spellStart"/>
-            <w:r>
-              <w:rPr>
-                <w:rFonts w:ascii="Segoe UI" w:eastAsia="Times New Roman" w:hAnsi="Segoe UI" w:cs="Segoe UI"/>
-                <w:color w:val="1F2328"/>
-                <w:kern w:val="0"/>
-                <w:sz w:val="24"/>
-                <w:szCs w:val="24"/>
-                <w:lang w:val="lv-LV" w:eastAsia="en-SE"/>
-                <w14:ligatures w14:val="none"/>
-              </w:rPr>
-              <w:t>haves</w:t>
-            </w:r>
-            <w:proofErr w:type="spellEnd"/>
+              <w:t>A-&gt; Must haves</w:t>
+            </w:r>
           </w:p>
         </w:tc>
         <w:tc>
@@ -3126,48 +4183,8 @@
                 <w:lang w:val="lv-LV" w:eastAsia="en-SE"/>
                 <w14:ligatures w14:val="none"/>
               </w:rPr>
-              <w:t xml:space="preserve">A-&gt; </w:t>
-            </w:r>
-            <w:proofErr w:type="spellStart"/>
-            <w:r>
-              <w:rPr>
-                <w:rFonts w:ascii="Segoe UI" w:eastAsia="Times New Roman" w:hAnsi="Segoe UI" w:cs="Segoe UI"/>
-                <w:color w:val="1F2328"/>
-                <w:kern w:val="0"/>
-                <w:sz w:val="24"/>
-                <w:szCs w:val="24"/>
-                <w:lang w:val="lv-LV" w:eastAsia="en-SE"/>
-                <w14:ligatures w14:val="none"/>
-              </w:rPr>
-              <w:t>Must</w:t>
-            </w:r>
-            <w:proofErr w:type="spellEnd"/>
-            <w:r>
-              <w:rPr>
-                <w:rFonts w:ascii="Segoe UI" w:eastAsia="Times New Roman" w:hAnsi="Segoe UI" w:cs="Segoe UI"/>
-                <w:color w:val="1F2328"/>
-                <w:kern w:val="0"/>
-                <w:sz w:val="24"/>
-                <w:szCs w:val="24"/>
-                <w:lang w:val="lv-LV" w:eastAsia="en-SE"/>
-                <w14:ligatures w14:val="none"/>
-              </w:rPr>
-              <w:t xml:space="preserve"> </w:t>
-            </w:r>
-            <w:proofErr w:type="spellStart"/>
-            <w:r>
-              <w:rPr>
-                <w:rFonts w:ascii="Segoe UI" w:eastAsia="Times New Roman" w:hAnsi="Segoe UI" w:cs="Segoe UI"/>
-                <w:color w:val="1F2328"/>
-                <w:kern w:val="0"/>
-                <w:sz w:val="24"/>
-                <w:szCs w:val="24"/>
-                <w:lang w:val="lv-LV" w:eastAsia="en-SE"/>
-                <w14:ligatures w14:val="none"/>
-              </w:rPr>
-              <w:t>haves</w:t>
-            </w:r>
-            <w:proofErr w:type="spellEnd"/>
+              <w:t>A-&gt; Must haves</w:t>
+            </w:r>
           </w:p>
         </w:tc>
         <w:tc>
@@ -3321,48 +4338,8 @@
                 <w:lang w:val="lv-LV" w:eastAsia="en-SE"/>
                 <w14:ligatures w14:val="none"/>
               </w:rPr>
-              <w:t xml:space="preserve">B-&gt; </w:t>
-            </w:r>
-            <w:proofErr w:type="spellStart"/>
-            <w:r>
-              <w:rPr>
-                <w:rFonts w:ascii="Segoe UI" w:eastAsia="Times New Roman" w:hAnsi="Segoe UI" w:cs="Segoe UI"/>
-                <w:color w:val="1F2328"/>
-                <w:kern w:val="0"/>
-                <w:sz w:val="24"/>
-                <w:szCs w:val="24"/>
-                <w:lang w:val="lv-LV" w:eastAsia="en-SE"/>
-                <w14:ligatures w14:val="none"/>
-              </w:rPr>
-              <w:t>Should</w:t>
-            </w:r>
-            <w:proofErr w:type="spellEnd"/>
-            <w:r>
-              <w:rPr>
-                <w:rFonts w:ascii="Segoe UI" w:eastAsia="Times New Roman" w:hAnsi="Segoe UI" w:cs="Segoe UI"/>
-                <w:color w:val="1F2328"/>
-                <w:kern w:val="0"/>
-                <w:sz w:val="24"/>
-                <w:szCs w:val="24"/>
-                <w:lang w:val="lv-LV" w:eastAsia="en-SE"/>
-                <w14:ligatures w14:val="none"/>
-              </w:rPr>
-              <w:t xml:space="preserve"> </w:t>
-            </w:r>
-            <w:proofErr w:type="spellStart"/>
-            <w:r>
-              <w:rPr>
-                <w:rFonts w:ascii="Segoe UI" w:eastAsia="Times New Roman" w:hAnsi="Segoe UI" w:cs="Segoe UI"/>
-                <w:color w:val="1F2328"/>
-                <w:kern w:val="0"/>
-                <w:sz w:val="24"/>
-                <w:szCs w:val="24"/>
-                <w:lang w:val="lv-LV" w:eastAsia="en-SE"/>
-                <w14:ligatures w14:val="none"/>
-              </w:rPr>
-              <w:t>haves</w:t>
-            </w:r>
-            <w:proofErr w:type="spellEnd"/>
+              <w:t>B-&gt; Should haves</w:t>
+            </w:r>
           </w:p>
         </w:tc>
         <w:tc>
@@ -3476,33 +4453,7 @@
                 <w:lang w:val="lv-LV" w:eastAsia="en-SE"/>
                 <w14:ligatures w14:val="none"/>
               </w:rPr>
-              <w:t>Pasūtītājs vēlas trīs glabāšanas stratēģijas (</w:t>
-            </w:r>
-            <w:proofErr w:type="spellStart"/>
-            <w:r>
-              <w:rPr>
-                <w:rFonts w:ascii="Segoe UI" w:eastAsia="Times New Roman" w:hAnsi="Segoe UI" w:cs="Segoe UI"/>
-                <w:color w:val="1F2328"/>
-                <w:kern w:val="0"/>
-                <w:sz w:val="24"/>
-                <w:szCs w:val="24"/>
-                <w:lang w:val="lv-LV" w:eastAsia="en-SE"/>
-                <w14:ligatures w14:val="none"/>
-              </w:rPr>
-              <w:t>db</w:t>
-            </w:r>
-            <w:proofErr w:type="spellEnd"/>
-            <w:r>
-              <w:rPr>
-                <w:rFonts w:ascii="Segoe UI" w:eastAsia="Times New Roman" w:hAnsi="Segoe UI" w:cs="Segoe UI"/>
-                <w:color w:val="1F2328"/>
-                <w:kern w:val="0"/>
-                <w:sz w:val="24"/>
-                <w:szCs w:val="24"/>
-                <w:lang w:val="lv-LV" w:eastAsia="en-SE"/>
-                <w14:ligatures w14:val="none"/>
-              </w:rPr>
-              <w:t>/arhīvs/dzēš), jo ir jāņem vērā veiktspēja arī pie bieža datu apmaiņas intervāla</w:t>
+              <w:t>Pasūtītājs vēlas trīs glabāšanas stratēģijas (db/arhīvs/dzēš), jo ir jāņem vērā veiktspēja arī pie bieža datu apmaiņas intervāla</w:t>
             </w:r>
           </w:p>
         </w:tc>
@@ -3542,48 +4493,8 @@
                 <w:lang w:val="lv-LV" w:eastAsia="en-SE"/>
                 <w14:ligatures w14:val="none"/>
               </w:rPr>
-              <w:t xml:space="preserve">B-&gt; </w:t>
-            </w:r>
-            <w:proofErr w:type="spellStart"/>
-            <w:r>
-              <w:rPr>
-                <w:rFonts w:ascii="Segoe UI" w:eastAsia="Times New Roman" w:hAnsi="Segoe UI" w:cs="Segoe UI"/>
-                <w:color w:val="1F2328"/>
-                <w:kern w:val="0"/>
-                <w:sz w:val="24"/>
-                <w:szCs w:val="24"/>
-                <w:lang w:val="lv-LV" w:eastAsia="en-SE"/>
-                <w14:ligatures w14:val="none"/>
-              </w:rPr>
-              <w:t>Should</w:t>
-            </w:r>
-            <w:proofErr w:type="spellEnd"/>
-            <w:r>
-              <w:rPr>
-                <w:rFonts w:ascii="Segoe UI" w:eastAsia="Times New Roman" w:hAnsi="Segoe UI" w:cs="Segoe UI"/>
-                <w:color w:val="1F2328"/>
-                <w:kern w:val="0"/>
-                <w:sz w:val="24"/>
-                <w:szCs w:val="24"/>
-                <w:lang w:val="lv-LV" w:eastAsia="en-SE"/>
-                <w14:ligatures w14:val="none"/>
-              </w:rPr>
-              <w:t xml:space="preserve"> </w:t>
-            </w:r>
-            <w:proofErr w:type="spellStart"/>
-            <w:r>
-              <w:rPr>
-                <w:rFonts w:ascii="Segoe UI" w:eastAsia="Times New Roman" w:hAnsi="Segoe UI" w:cs="Segoe UI"/>
-                <w:color w:val="1F2328"/>
-                <w:kern w:val="0"/>
-                <w:sz w:val="24"/>
-                <w:szCs w:val="24"/>
-                <w:lang w:val="lv-LV" w:eastAsia="en-SE"/>
-                <w14:ligatures w14:val="none"/>
-              </w:rPr>
-              <w:t>haves</w:t>
-            </w:r>
-            <w:proofErr w:type="spellEnd"/>
+              <w:t>B-&gt; Should haves</w:t>
+            </w:r>
           </w:p>
         </w:tc>
         <w:tc>
@@ -3737,48 +4648,8 @@
                 <w:lang w:val="lv-LV" w:eastAsia="en-SE"/>
                 <w14:ligatures w14:val="none"/>
               </w:rPr>
-              <w:t xml:space="preserve">B-&gt; </w:t>
-            </w:r>
-            <w:proofErr w:type="spellStart"/>
-            <w:r>
-              <w:rPr>
-                <w:rFonts w:ascii="Segoe UI" w:eastAsia="Times New Roman" w:hAnsi="Segoe UI" w:cs="Segoe UI"/>
-                <w:color w:val="1F2328"/>
-                <w:kern w:val="0"/>
-                <w:sz w:val="24"/>
-                <w:szCs w:val="24"/>
-                <w:lang w:val="lv-LV" w:eastAsia="en-SE"/>
-                <w14:ligatures w14:val="none"/>
-              </w:rPr>
-              <w:t>Should</w:t>
-            </w:r>
-            <w:proofErr w:type="spellEnd"/>
-            <w:r>
-              <w:rPr>
-                <w:rFonts w:ascii="Segoe UI" w:eastAsia="Times New Roman" w:hAnsi="Segoe UI" w:cs="Segoe UI"/>
-                <w:color w:val="1F2328"/>
-                <w:kern w:val="0"/>
-                <w:sz w:val="24"/>
-                <w:szCs w:val="24"/>
-                <w:lang w:val="lv-LV" w:eastAsia="en-SE"/>
-                <w14:ligatures w14:val="none"/>
-              </w:rPr>
-              <w:t xml:space="preserve"> </w:t>
-            </w:r>
-            <w:proofErr w:type="spellStart"/>
-            <w:r>
-              <w:rPr>
-                <w:rFonts w:ascii="Segoe UI" w:eastAsia="Times New Roman" w:hAnsi="Segoe UI" w:cs="Segoe UI"/>
-                <w:color w:val="1F2328"/>
-                <w:kern w:val="0"/>
-                <w:sz w:val="24"/>
-                <w:szCs w:val="24"/>
-                <w:lang w:val="lv-LV" w:eastAsia="en-SE"/>
-                <w14:ligatures w14:val="none"/>
-              </w:rPr>
-              <w:t>haves</w:t>
-            </w:r>
-            <w:proofErr w:type="spellEnd"/>
+              <w:t>B-&gt; Should haves</w:t>
+            </w:r>
           </w:p>
         </w:tc>
         <w:tc>
@@ -3932,48 +4803,8 @@
                 <w:lang w:val="lv-LV" w:eastAsia="en-SE"/>
                 <w14:ligatures w14:val="none"/>
               </w:rPr>
-              <w:t xml:space="preserve">B-&gt; </w:t>
-            </w:r>
-            <w:proofErr w:type="spellStart"/>
-            <w:r>
-              <w:rPr>
-                <w:rFonts w:ascii="Segoe UI" w:eastAsia="Times New Roman" w:hAnsi="Segoe UI" w:cs="Segoe UI"/>
-                <w:color w:val="1F2328"/>
-                <w:kern w:val="0"/>
-                <w:sz w:val="24"/>
-                <w:szCs w:val="24"/>
-                <w:lang w:val="lv-LV" w:eastAsia="en-SE"/>
-                <w14:ligatures w14:val="none"/>
-              </w:rPr>
-              <w:t>Should</w:t>
-            </w:r>
-            <w:proofErr w:type="spellEnd"/>
-            <w:r>
-              <w:rPr>
-                <w:rFonts w:ascii="Segoe UI" w:eastAsia="Times New Roman" w:hAnsi="Segoe UI" w:cs="Segoe UI"/>
-                <w:color w:val="1F2328"/>
-                <w:kern w:val="0"/>
-                <w:sz w:val="24"/>
-                <w:szCs w:val="24"/>
-                <w:lang w:val="lv-LV" w:eastAsia="en-SE"/>
-                <w14:ligatures w14:val="none"/>
-              </w:rPr>
-              <w:t xml:space="preserve"> </w:t>
-            </w:r>
-            <w:proofErr w:type="spellStart"/>
-            <w:r>
-              <w:rPr>
-                <w:rFonts w:ascii="Segoe UI" w:eastAsia="Times New Roman" w:hAnsi="Segoe UI" w:cs="Segoe UI"/>
-                <w:color w:val="1F2328"/>
-                <w:kern w:val="0"/>
-                <w:sz w:val="24"/>
-                <w:szCs w:val="24"/>
-                <w:lang w:val="lv-LV" w:eastAsia="en-SE"/>
-                <w14:ligatures w14:val="none"/>
-              </w:rPr>
-              <w:t>haves</w:t>
-            </w:r>
-            <w:proofErr w:type="spellEnd"/>
+              <w:t>B-&gt; Should haves</w:t>
+            </w:r>
           </w:p>
         </w:tc>
         <w:tc>
@@ -4127,48 +4958,8 @@
                 <w:lang w:val="lv-LV" w:eastAsia="en-SE"/>
                 <w14:ligatures w14:val="none"/>
               </w:rPr>
-              <w:t xml:space="preserve">C-&gt; </w:t>
-            </w:r>
-            <w:proofErr w:type="spellStart"/>
-            <w:r>
-              <w:rPr>
-                <w:rFonts w:ascii="Segoe UI" w:eastAsia="Times New Roman" w:hAnsi="Segoe UI" w:cs="Segoe UI"/>
-                <w:color w:val="1F2328"/>
-                <w:kern w:val="0"/>
-                <w:sz w:val="24"/>
-                <w:szCs w:val="24"/>
-                <w:lang w:val="lv-LV" w:eastAsia="en-SE"/>
-                <w14:ligatures w14:val="none"/>
-              </w:rPr>
-              <w:t>Could</w:t>
-            </w:r>
-            <w:proofErr w:type="spellEnd"/>
-            <w:r>
-              <w:rPr>
-                <w:rFonts w:ascii="Segoe UI" w:eastAsia="Times New Roman" w:hAnsi="Segoe UI" w:cs="Segoe UI"/>
-                <w:color w:val="1F2328"/>
-                <w:kern w:val="0"/>
-                <w:sz w:val="24"/>
-                <w:szCs w:val="24"/>
-                <w:lang w:val="lv-LV" w:eastAsia="en-SE"/>
-                <w14:ligatures w14:val="none"/>
-              </w:rPr>
-              <w:t xml:space="preserve"> </w:t>
-            </w:r>
-            <w:proofErr w:type="spellStart"/>
-            <w:r>
-              <w:rPr>
-                <w:rFonts w:ascii="Segoe UI" w:eastAsia="Times New Roman" w:hAnsi="Segoe UI" w:cs="Segoe UI"/>
-                <w:color w:val="1F2328"/>
-                <w:kern w:val="0"/>
-                <w:sz w:val="24"/>
-                <w:szCs w:val="24"/>
-                <w:lang w:val="lv-LV" w:eastAsia="en-SE"/>
-                <w14:ligatures w14:val="none"/>
-              </w:rPr>
-              <w:t>haves</w:t>
-            </w:r>
-            <w:proofErr w:type="spellEnd"/>
+              <w:t>C-&gt; Could haves</w:t>
+            </w:r>
           </w:p>
         </w:tc>
         <w:tc>
@@ -4268,21 +5059,7 @@
         <w:rPr>
           <w:lang w:val="lv-LV"/>
         </w:rPr>
-        <w:t xml:space="preserve">Sistēmu var </w:t>
-      </w:r>
-      <w:proofErr w:type="spellStart"/>
-      <w:r>
-        <w:rPr>
-          <w:lang w:val="lv-LV"/>
-        </w:rPr>
-        <w:t>ieadalīt</w:t>
-      </w:r>
-      <w:proofErr w:type="spellEnd"/>
-      <w:r>
-        <w:rPr>
-          <w:lang w:val="lv-LV"/>
-        </w:rPr>
-        <w:t xml:space="preserve"> 4 daļās: </w:t>
+        <w:t xml:space="preserve">Sistēmu var ieadalīt 4 daļās: </w:t>
       </w:r>
     </w:p>
     <w:p>
@@ -4301,21 +5078,7 @@
         <w:rPr>
           <w:lang w:val="lv-LV"/>
         </w:rPr>
-        <w:t xml:space="preserve">mērījumu ievākšana (centrmezgli, </w:t>
-      </w:r>
-      <w:proofErr w:type="spellStart"/>
-      <w:r>
-        <w:rPr>
-          <w:lang w:val="lv-LV"/>
-        </w:rPr>
-        <w:t>mikrokontrolieri</w:t>
-      </w:r>
-      <w:proofErr w:type="spellEnd"/>
-      <w:r>
-        <w:rPr>
-          <w:lang w:val="lv-LV"/>
-        </w:rPr>
-        <w:t xml:space="preserve">),  </w:t>
+        <w:t xml:space="preserve">mērījumu ievākšana (centrmezgli, mikrokontrolieri),  </w:t>
       </w:r>
     </w:p>
     <w:p>
@@ -4334,21 +5097,7 @@
         <w:rPr>
           <w:lang w:val="lv-LV"/>
         </w:rPr>
-        <w:t xml:space="preserve">mērījumu arhivēšanas un dzēšanas </w:t>
-      </w:r>
-      <w:proofErr w:type="spellStart"/>
-      <w:r>
-        <w:rPr>
-          <w:lang w:val="lv-LV"/>
-        </w:rPr>
-        <w:t>chron</w:t>
-      </w:r>
-      <w:proofErr w:type="spellEnd"/>
-      <w:r>
-        <w:rPr>
-          <w:lang w:val="lv-LV"/>
-        </w:rPr>
-        <w:t xml:space="preserve"> uzdevums, </w:t>
+        <w:t xml:space="preserve">mērījumu arhivēšanas un dzēšanas chron uzdevums, </w:t>
       </w:r>
     </w:p>
     <w:p>
@@ -4367,21 +5116,7 @@
         <w:rPr>
           <w:lang w:val="lv-LV"/>
         </w:rPr>
-        <w:t>mērījumu ievākšanas saglabātāji (.</w:t>
-      </w:r>
-      <w:proofErr w:type="spellStart"/>
-      <w:r>
-        <w:rPr>
-          <w:lang w:val="lv-LV"/>
-        </w:rPr>
-        <w:t>py</w:t>
-      </w:r>
-      <w:proofErr w:type="spellEnd"/>
-      <w:r>
-        <w:rPr>
-          <w:lang w:val="lv-LV"/>
-        </w:rPr>
-        <w:t xml:space="preserve"> skripti uz 2 portiem), </w:t>
+        <w:t xml:space="preserve">mērījumu ievākšanas saglabātāji (.py skripti uz 2 portiem), </w:t>
       </w:r>
     </w:p>
     <w:p>
@@ -4402,61 +5137,11 @@
           <w:docGrid w:linePitch="360"/>
         </w:sectPr>
       </w:pPr>
-      <w:proofErr w:type="spellStart"/>
-      <w:r>
-        <w:rPr>
-          <w:lang w:val="lv-LV"/>
-        </w:rPr>
-        <w:t>web</w:t>
-      </w:r>
-      <w:proofErr w:type="spellEnd"/>
-      <w:r>
-        <w:rPr>
-          <w:lang w:val="lv-LV"/>
-        </w:rPr>
-        <w:t xml:space="preserve"> GUI lietotājam (</w:t>
-      </w:r>
-      <w:proofErr w:type="spellStart"/>
-      <w:r>
-        <w:rPr>
-          <w:lang w:val="lv-LV"/>
-        </w:rPr>
-        <w:t>Go</w:t>
-      </w:r>
-      <w:proofErr w:type="spellEnd"/>
-      <w:r>
-        <w:rPr>
-          <w:lang w:val="lv-LV"/>
-        </w:rPr>
-        <w:t xml:space="preserve"> valodā rakstītā </w:t>
-      </w:r>
-      <w:proofErr w:type="spellStart"/>
-      <w:r>
-        <w:rPr>
-          <w:lang w:val="lv-LV"/>
-        </w:rPr>
-        <w:t>Grafana</w:t>
-      </w:r>
-      <w:proofErr w:type="spellEnd"/>
-      <w:r>
-        <w:rPr>
-          <w:lang w:val="lv-LV"/>
-        </w:rPr>
-        <w:t xml:space="preserve"> un CRUD operāciju </w:t>
-      </w:r>
-      <w:proofErr w:type="spellStart"/>
-      <w:r>
-        <w:rPr>
-          <w:lang w:val="lv-LV"/>
-        </w:rPr>
-        <w:t>Django</w:t>
-      </w:r>
-      <w:proofErr w:type="spellEnd"/>
-      <w:r>
-        <w:rPr>
-          <w:lang w:val="lv-LV"/>
-        </w:rPr>
-        <w:t>).</w:t>
+      <w:r>
+        <w:rPr>
+          <w:lang w:val="lv-LV"/>
+        </w:rPr>
+        <w:t>web GUI lietotājam (Go valodā rakstītā Grafana un CRUD operāciju Django).</w:t>
       </w:r>
     </w:p>
     <w:p>
@@ -4495,7 +5180,7 @@
                     <pic:cNvPicPr/>
                   </pic:nvPicPr>
                   <pic:blipFill>
-                    <a:blip r:embed="rId10">
+                    <a:blip r:embed="rId19">
                       <a:extLst>
                         <a:ext uri="{28A0092B-C50C-407E-A947-70E740481C1C}">
                           <a14:useLocalDpi xmlns:a14="http://schemas.microsoft.com/office/drawing/2010/main" val="0"/>
@@ -4656,88 +5341,24 @@
           <w:lang w:val="lv-LV"/>
         </w:rPr>
       </w:pPr>
-      <w:proofErr w:type="spellStart"/>
-      <w:r>
-        <w:rPr>
-          <w:lang w:val="lv-LV"/>
-        </w:rPr>
-        <w:t>Arhivatora</w:t>
-      </w:r>
-      <w:proofErr w:type="spellEnd"/>
-      <w:r>
-        <w:rPr>
-          <w:lang w:val="lv-LV"/>
-        </w:rPr>
-        <w:t xml:space="preserve"> algoritms:</w:t>
-      </w:r>
-    </w:p>
-    <w:p>
-      <w:pPr>
-        <w:rPr>
-          <w:lang w:val="lv-LV"/>
-        </w:rPr>
-      </w:pPr>
-      <w:r>
-        <w:rPr>
-          <w:lang w:val="lv-LV"/>
-        </w:rPr>
-        <w:t xml:space="preserve">Dzēšana notiek ar panda </w:t>
-      </w:r>
-      <w:proofErr w:type="spellStart"/>
-      <w:r>
-        <w:rPr>
-          <w:lang w:val="lv-LV"/>
-        </w:rPr>
-        <w:t>dataframes</w:t>
-      </w:r>
-      <w:proofErr w:type="spellEnd"/>
-      <w:r>
-        <w:rPr>
-          <w:lang w:val="lv-LV"/>
-        </w:rPr>
-        <w:t xml:space="preserve"> palīdzību, jo arhivējot no </w:t>
-      </w:r>
-      <w:proofErr w:type="spellStart"/>
-      <w:r>
-        <w:rPr>
-          <w:lang w:val="lv-LV"/>
-        </w:rPr>
-        <w:t>sql</w:t>
-      </w:r>
-      <w:proofErr w:type="spellEnd"/>
-      <w:r>
-        <w:rPr>
-          <w:lang w:val="lv-LV"/>
-        </w:rPr>
-        <w:t xml:space="preserve"> tiek pārveidots </w:t>
-      </w:r>
-      <w:proofErr w:type="spellStart"/>
-      <w:r>
-        <w:rPr>
-          <w:lang w:val="lv-LV"/>
-        </w:rPr>
-        <w:t>csv</w:t>
-      </w:r>
-      <w:proofErr w:type="spellEnd"/>
-      <w:r>
-        <w:rPr>
-          <w:lang w:val="lv-LV"/>
-        </w:rPr>
-        <w:t xml:space="preserve"> un ar </w:t>
-      </w:r>
-      <w:proofErr w:type="spellStart"/>
-      <w:r>
-        <w:rPr>
-          <w:lang w:val="lv-LV"/>
-        </w:rPr>
-        <w:t>gzip</w:t>
-      </w:r>
-      <w:proofErr w:type="spellEnd"/>
-      <w:r>
-        <w:rPr>
-          <w:lang w:val="lv-LV"/>
-        </w:rPr>
-        <w:t xml:space="preserve"> saspiests.</w:t>
+      <w:r>
+        <w:rPr>
+          <w:lang w:val="lv-LV"/>
+        </w:rPr>
+        <w:t>Arhivatora algoritms:</w:t>
+      </w:r>
+    </w:p>
+    <w:p>
+      <w:pPr>
+        <w:rPr>
+          <w:lang w:val="lv-LV"/>
+        </w:rPr>
+      </w:pPr>
+      <w:r>
+        <w:rPr>
+          <w:lang w:val="lv-LV"/>
+        </w:rPr>
+        <w:t>Dzēšana notiek ar panda dataframes palīdzību, jo arhivējot no sql tiek pārveidots csv un ar gzip saspiests.</w:t>
       </w:r>
     </w:p>
     <w:p>
@@ -4768,7 +5389,7 @@
                     <pic:cNvPicPr/>
                   </pic:nvPicPr>
                   <pic:blipFill>
-                    <a:blip r:embed="rId11"/>
+                    <a:blip r:embed="rId20"/>
                     <a:stretch>
                       <a:fillRect/>
                     </a:stretch>
@@ -4806,35 +5427,7 @@
           <w:lang w:val="lv-LV"/>
         </w:rPr>
         <w:lastRenderedPageBreak/>
-        <w:t>Centrmezgla (</w:t>
-      </w:r>
-      <w:proofErr w:type="spellStart"/>
-      <w:r>
-        <w:rPr>
-          <w:lang w:val="lv-LV"/>
-        </w:rPr>
-        <w:t>mikrokontroliera</w:t>
-      </w:r>
-      <w:proofErr w:type="spellEnd"/>
-      <w:r>
-        <w:rPr>
-          <w:lang w:val="lv-LV"/>
-        </w:rPr>
-        <w:t xml:space="preserve">) algoritms (katra grupa ir atsevišķs </w:t>
-      </w:r>
-      <w:proofErr w:type="spellStart"/>
-      <w:r>
-        <w:rPr>
-          <w:lang w:val="lv-LV"/>
-        </w:rPr>
-        <w:t>async</w:t>
-      </w:r>
-      <w:proofErr w:type="spellEnd"/>
-      <w:r>
-        <w:rPr>
-          <w:lang w:val="lv-LV"/>
-        </w:rPr>
-        <w:t xml:space="preserve"> tasks):</w:t>
+        <w:t>Centrmezgla (mikrokontroliera) algoritms (katra grupa ir atsevišķs async tasks):</w:t>
       </w:r>
       <w:r>
         <w:t xml:space="preserve"> </w:t>
@@ -4883,7 +5476,7 @@
                     <pic:cNvPicPr/>
                   </pic:nvPicPr>
                   <pic:blipFill>
-                    <a:blip r:embed="rId12">
+                    <a:blip r:embed="rId21">
                       <a:extLst>
                         <a:ext uri="{28A0092B-C50C-407E-A947-70E740481C1C}">
                           <a14:useLocalDpi xmlns:a14="http://schemas.microsoft.com/office/drawing/2010/main" val="0"/>
@@ -5076,7 +5669,7 @@
                     <pic:cNvPicPr/>
                   </pic:nvPicPr>
                   <pic:blipFill>
-                    <a:blip r:embed="rId13"/>
+                    <a:blip r:embed="rId22"/>
                     <a:stretch>
                       <a:fillRect/>
                     </a:stretch>
@@ -5189,7 +5782,7 @@
                     <pic:cNvPicPr/>
                   </pic:nvPicPr>
                   <pic:blipFill>
-                    <a:blip r:embed="rId14">
+                    <a:blip r:embed="rId23">
                       <a:extLst>
                         <a:ext uri="{28A0092B-C50C-407E-A947-70E740481C1C}">
                           <a14:useLocalDpi xmlns:a14="http://schemas.microsoft.com/office/drawing/2010/main" val="0"/>
@@ -5236,7 +5829,7 @@
                     <pic:cNvPicPr/>
                   </pic:nvPicPr>
                   <pic:blipFill>
-                    <a:blip r:embed="rId15"/>
+                    <a:blip r:embed="rId24"/>
                     <a:stretch>
                       <a:fillRect/>
                     </a:stretch>
@@ -5322,7 +5915,7 @@
                     <pic:cNvPicPr/>
                   </pic:nvPicPr>
                   <pic:blipFill>
-                    <a:blip r:embed="rId16">
+                    <a:blip r:embed="rId25">
                       <a:extLst>
                         <a:ext uri="{28A0092B-C50C-407E-A947-70E740481C1C}">
                           <a14:useLocalDpi xmlns:a14="http://schemas.microsoft.com/office/drawing/2010/main" val="0"/>
@@ -5472,63 +6065,7 @@
         <w:rPr>
           <w:lang w:val="lv-LV"/>
         </w:rPr>
-        <w:t xml:space="preserve">Novērtējot ieguvām samērā augstu novērtējuma procentu. Tas liecina ka savus mērķus sasniedzām, pat neskatoties uz to, ka, piemēram, drošība ir novērtēta augstu, jo pievienot </w:t>
-      </w:r>
-      <w:proofErr w:type="spellStart"/>
-      <w:r>
-        <w:rPr>
-          <w:lang w:val="lv-LV"/>
-        </w:rPr>
-        <w:t>middleware</w:t>
-      </w:r>
-      <w:proofErr w:type="spellEnd"/>
-      <w:r>
-        <w:rPr>
-          <w:lang w:val="lv-LV"/>
-        </w:rPr>
-        <w:t xml:space="preserve">, kas tāpat kā </w:t>
-      </w:r>
-      <w:proofErr w:type="spellStart"/>
-      <w:r>
-        <w:rPr>
-          <w:lang w:val="lv-LV"/>
-        </w:rPr>
-        <w:t>šībrīža</w:t>
-      </w:r>
-      <w:proofErr w:type="spellEnd"/>
-      <w:r>
-        <w:rPr>
-          <w:lang w:val="lv-LV"/>
-        </w:rPr>
-        <w:t xml:space="preserve"> </w:t>
-      </w:r>
-      <w:proofErr w:type="spellStart"/>
-      <w:r>
-        <w:rPr>
-          <w:lang w:val="lv-LV"/>
-        </w:rPr>
-        <w:t>middleware</w:t>
-      </w:r>
-      <w:proofErr w:type="spellEnd"/>
-      <w:r>
-        <w:rPr>
-          <w:lang w:val="lv-LV"/>
-        </w:rPr>
-        <w:t xml:space="preserve"> pārraksta noklusējuma prasību uz jebkuru simbolu un garuma atļaušanu lietotājvārdā un parolē, veiktu drošības prasību nodrošināšanu, ir samērā triviāls, mazāk nekā 2 cilvēkdienās paveicams uzdevums (protams, ja drošības algoritms jau ir </w:t>
-      </w:r>
-      <w:proofErr w:type="spellStart"/>
-      <w:r>
-        <w:rPr>
-          <w:lang w:val="lv-LV"/>
-        </w:rPr>
-        <w:t>python</w:t>
-      </w:r>
-      <w:proofErr w:type="spellEnd"/>
-      <w:r>
-        <w:rPr>
-          <w:lang w:val="lv-LV"/>
-        </w:rPr>
-        <w:t xml:space="preserve"> valodā realizēts gatavs).</w:t>
+        <w:t>Novērtējot ieguvām samērā augstu novērtējuma procentu. Tas liecina ka savus mērķus sasniedzām, pat neskatoties uz to, ka, piemēram, drošība ir novērtēta augstu, jo pievienot middleware, kas tāpat kā šībrīža middleware pārraksta noklusējuma prasību uz jebkuru simbolu un garuma atļaušanu lietotājvārdā un parolē, veiktu drošības prasību nodrošināšanu, ir samērā triviāls, mazāk nekā 2 cilvēkdienās paveicams uzdevums (protams, ja drošības algoritms jau ir python valodā realizēts gatavs).</w:t>
       </w:r>
     </w:p>
     <w:p>
@@ -5864,14 +6401,12 @@
         </w:rPr>
         <w:t xml:space="preserve">, </w:t>
       </w:r>
-      <w:proofErr w:type="spellStart"/>
       <w:r>
         <w:rPr>
           <w:lang w:val="lv-LV"/>
         </w:rPr>
         <w:t>Kustināmības</w:t>
       </w:r>
-      <w:proofErr w:type="spellEnd"/>
       <w:r>
         <w:rPr>
           <w:lang w:val="lv-LV"/>
@@ -5945,7 +6480,7 @@
                     <pic:cNvPicPr/>
                   </pic:nvPicPr>
                   <pic:blipFill>
-                    <a:blip r:embed="rId17">
+                    <a:blip r:embed="rId26">
                       <a:extLst>
                         <a:ext uri="{28A0092B-C50C-407E-A947-70E740481C1C}">
                           <a14:useLocalDpi xmlns:a14="http://schemas.microsoft.com/office/drawing/2010/main" val="0"/>
@@ -5991,7 +6526,7 @@
                     <pic:cNvPicPr/>
                   </pic:nvPicPr>
                   <pic:blipFill>
-                    <a:blip r:embed="rId18"/>
+                    <a:blip r:embed="rId27"/>
                     <a:stretch>
                       <a:fillRect/>
                     </a:stretch>
@@ -6078,21 +6613,7 @@
         <w:rPr>
           <w:lang w:val="lv-LV"/>
         </w:rPr>
-        <w:t xml:space="preserve">Sistēma ir labi piemērota sensoru mērījumu apskatei un pārraudzībai, kamēr vien tiek ievadīti realitātei atbilstoši metadati. Sistēmā ir iekļauti vairāki būtībā atšķirīgi sensoru tipi, tātad tā ir tuvināta reālajai </w:t>
-      </w:r>
-      <w:proofErr w:type="spellStart"/>
-      <w:r>
-        <w:rPr>
-          <w:lang w:val="lv-LV"/>
-        </w:rPr>
-        <w:t>situācijāi</w:t>
-      </w:r>
-      <w:proofErr w:type="spellEnd"/>
-      <w:r>
-        <w:rPr>
-          <w:lang w:val="lv-LV"/>
-        </w:rPr>
-        <w:t xml:space="preserve"> (lauka apstākļiem).</w:t>
+        <w:t>Sistēma ir labi piemērota sensoru mērījumu apskatei un pārraudzībai, kamēr vien tiek ievadīti realitātei atbilstoši metadati. Sistēmā ir iekļauti vairāki būtībā atšķirīgi sensoru tipi, tātad tā ir tuvināta reālajai situācijāi (lauka apstākļiem).</w:t>
       </w:r>
     </w:p>
     <w:p>
@@ -6114,21 +6635,7 @@
         <w:rPr>
           <w:lang w:val="lv-LV"/>
         </w:rPr>
-        <w:t xml:space="preserve">Sistēmas precizitāte ir atbilstoša konkrēto </w:t>
-      </w:r>
-      <w:proofErr w:type="spellStart"/>
-      <w:r>
-        <w:rPr>
-          <w:lang w:val="lv-LV"/>
-        </w:rPr>
-        <w:t>mikrokontrolieru</w:t>
-      </w:r>
-      <w:proofErr w:type="spellEnd"/>
-      <w:r>
-        <w:rPr>
-          <w:lang w:val="lv-LV"/>
-        </w:rPr>
-        <w:t xml:space="preserve"> precizitātei. Digitāliem sensoriem, protams tas ir iekšējs rādītājs, taču analogajam sensora piemēram mēs izmantojam 12 bitu ADC, kas ļauj iegūt 4096 vērtības.</w:t>
+        <w:t>Sistēmas precizitāte ir atbilstoša konkrēto mikrokontrolieru precizitātei. Digitāliem sensoriem, protams tas ir iekšējs rādītājs, taču analogajam sensora piemēram mēs izmantojam 12 bitu ADC, kas ļauj iegūt 4096 vērtības.</w:t>
       </w:r>
     </w:p>
     <w:p>
@@ -6150,49 +6657,7 @@
         <w:rPr>
           <w:lang w:val="lv-LV"/>
         </w:rPr>
-        <w:t xml:space="preserve">Sistēma spēj sadarboties ar </w:t>
-      </w:r>
-      <w:proofErr w:type="spellStart"/>
-      <w:r>
-        <w:rPr>
-          <w:lang w:val="lv-LV"/>
-        </w:rPr>
-        <w:t>Raspberry</w:t>
-      </w:r>
-      <w:proofErr w:type="spellEnd"/>
-      <w:r>
-        <w:rPr>
-          <w:lang w:val="lv-LV"/>
-        </w:rPr>
-        <w:t xml:space="preserve"> </w:t>
-      </w:r>
-      <w:proofErr w:type="spellStart"/>
-      <w:r>
-        <w:rPr>
-          <w:lang w:val="lv-LV"/>
-        </w:rPr>
-        <w:t>pi</w:t>
-      </w:r>
-      <w:proofErr w:type="spellEnd"/>
-      <w:r>
-        <w:rPr>
-          <w:lang w:val="lv-LV"/>
-        </w:rPr>
-        <w:t xml:space="preserve">, ja to lieto kā centrmezglu vai pat kā </w:t>
-      </w:r>
-      <w:proofErr w:type="spellStart"/>
-      <w:r>
-        <w:rPr>
-          <w:lang w:val="lv-LV"/>
-        </w:rPr>
-        <w:t>wifi</w:t>
-      </w:r>
-      <w:proofErr w:type="spellEnd"/>
-      <w:r>
-        <w:rPr>
-          <w:lang w:val="lv-LV"/>
-        </w:rPr>
-        <w:t xml:space="preserve"> nodrošinātāju pārējie centrmezgliem.</w:t>
+        <w:t>Sistēma spēj sadarboties ar Raspberry pi, ja to lieto kā centrmezglu vai pat kā wifi nodrošinātāju pārējie centrmezgliem.</w:t>
       </w:r>
     </w:p>
     <w:p>
@@ -6299,21 +6764,7 @@
         <w:rPr>
           <w:lang w:val="lv-LV"/>
         </w:rPr>
-        <w:t xml:space="preserve">sasniedzām visas obligātās funkcijas, bet atmetām 3d </w:t>
-      </w:r>
-      <w:proofErr w:type="spellStart"/>
-      <w:r>
-        <w:rPr>
-          <w:lang w:val="lv-LV"/>
-        </w:rPr>
-        <w:t>vizualizāciju</w:t>
-      </w:r>
-      <w:proofErr w:type="spellEnd"/>
-      <w:r>
-        <w:rPr>
-          <w:lang w:val="lv-LV"/>
-        </w:rPr>
-        <w:t>.</w:t>
+        <w:t>sasniedzām visas obligātās funkcijas, bet atmetām 3d vizualizāciju.</w:t>
       </w:r>
     </w:p>
     <w:p>
@@ -6490,63 +6941,7 @@
         <w:rPr>
           <w:lang w:val="lv-LV"/>
         </w:rPr>
-        <w:t xml:space="preserve">Metadatu ievade ir attēlota ar pārbaudīto </w:t>
-      </w:r>
-      <w:proofErr w:type="spellStart"/>
-      <w:r>
-        <w:rPr>
-          <w:lang w:val="lv-LV"/>
-        </w:rPr>
-        <w:t>datatables</w:t>
-      </w:r>
-      <w:proofErr w:type="spellEnd"/>
-      <w:r>
-        <w:rPr>
-          <w:lang w:val="lv-LV"/>
-        </w:rPr>
-        <w:t xml:space="preserve"> </w:t>
-      </w:r>
-      <w:proofErr w:type="spellStart"/>
-      <w:r>
-        <w:rPr>
-          <w:lang w:val="lv-LV"/>
-        </w:rPr>
-        <w:t>saskarni</w:t>
-      </w:r>
-      <w:proofErr w:type="spellEnd"/>
-      <w:r>
-        <w:rPr>
-          <w:lang w:val="lv-LV"/>
-        </w:rPr>
-        <w:t xml:space="preserve">, tāpat lietotāja grafiki ar pārbaudīto </w:t>
-      </w:r>
-      <w:proofErr w:type="spellStart"/>
-      <w:r>
-        <w:rPr>
-          <w:lang w:val="lv-LV"/>
-        </w:rPr>
-        <w:t>Grafana</w:t>
-      </w:r>
-      <w:proofErr w:type="spellEnd"/>
-      <w:r>
-        <w:rPr>
-          <w:lang w:val="lv-LV"/>
-        </w:rPr>
-        <w:t xml:space="preserve"> </w:t>
-      </w:r>
-      <w:proofErr w:type="spellStart"/>
-      <w:r>
-        <w:rPr>
-          <w:lang w:val="lv-LV"/>
-        </w:rPr>
-        <w:t>saskarni</w:t>
-      </w:r>
-      <w:proofErr w:type="spellEnd"/>
-      <w:r>
-        <w:rPr>
-          <w:lang w:val="lv-LV"/>
-        </w:rPr>
-        <w:t>.</w:t>
+        <w:t>Metadatu ievade ir attēlota ar pārbaudīto datatables saskarni, tāpat lietotāja grafiki ar pārbaudīto Grafana saskarni.</w:t>
       </w:r>
     </w:p>
     <w:p>
@@ -6560,21 +6955,7 @@
         <w:rPr>
           <w:lang w:val="lv-LV"/>
         </w:rPr>
-        <w:t xml:space="preserve">Mūsuprāt grafiki ir daudz pievilcīgāki par sākotnējo </w:t>
-      </w:r>
-      <w:proofErr w:type="spellStart"/>
-      <w:r>
-        <w:rPr>
-          <w:lang w:val="lv-LV"/>
-        </w:rPr>
-        <w:t>matplotlib</w:t>
-      </w:r>
-      <w:proofErr w:type="spellEnd"/>
-      <w:r>
-        <w:rPr>
-          <w:lang w:val="lv-LV"/>
-        </w:rPr>
-        <w:t xml:space="preserve"> versiju.</w:t>
+        <w:t>Mūsuprāt grafiki ir daudz pievilcīgāki par sākotnējo matplotlib versiju.</w:t>
       </w:r>
     </w:p>
     <w:p>
@@ -6623,91 +7004,7 @@
         <w:rPr>
           <w:lang w:val="lv-LV"/>
         </w:rPr>
-        <w:t xml:space="preserve">Sistēma pēc </w:t>
-      </w:r>
-      <w:proofErr w:type="spellStart"/>
-      <w:r>
-        <w:rPr>
-          <w:lang w:val="lv-LV"/>
-        </w:rPr>
-        <w:t>ielādes</w:t>
-      </w:r>
-      <w:proofErr w:type="spellEnd"/>
-      <w:r>
-        <w:rPr>
-          <w:lang w:val="lv-LV"/>
-        </w:rPr>
-        <w:t xml:space="preserve"> ļauj </w:t>
-      </w:r>
-      <w:proofErr w:type="spellStart"/>
-      <w:r>
-        <w:rPr>
-          <w:lang w:val="lv-LV"/>
-        </w:rPr>
-        <w:t>responsīvi</w:t>
-      </w:r>
-      <w:proofErr w:type="spellEnd"/>
-      <w:r>
-        <w:rPr>
-          <w:lang w:val="lv-LV"/>
-        </w:rPr>
-        <w:t xml:space="preserve"> kārtot, šķirot metadatus. </w:t>
-      </w:r>
-      <w:proofErr w:type="spellStart"/>
-      <w:r>
-        <w:rPr>
-          <w:lang w:val="lv-LV"/>
-        </w:rPr>
-        <w:t>Ielādes</w:t>
-      </w:r>
-      <w:proofErr w:type="spellEnd"/>
-      <w:r>
-        <w:rPr>
-          <w:lang w:val="lv-LV"/>
-        </w:rPr>
-        <w:t xml:space="preserve"> laiku gan neizdevās uzlabot, jo pēc python3 atjaunināšanas </w:t>
-      </w:r>
-      <w:proofErr w:type="spellStart"/>
-      <w:r>
-        <w:rPr>
-          <w:lang w:val="lv-LV"/>
-        </w:rPr>
-        <w:t>kešošanai</w:t>
-      </w:r>
-      <w:proofErr w:type="spellEnd"/>
-      <w:r>
-        <w:rPr>
-          <w:lang w:val="lv-LV"/>
-        </w:rPr>
-        <w:t xml:space="preserve"> piedāvā tikai </w:t>
-      </w:r>
-      <w:proofErr w:type="spellStart"/>
-      <w:r>
-        <w:rPr>
-          <w:lang w:val="lv-LV"/>
-        </w:rPr>
-        <w:t>memcached</w:t>
-      </w:r>
-      <w:proofErr w:type="spellEnd"/>
-      <w:r>
-        <w:rPr>
-          <w:lang w:val="lv-LV"/>
-        </w:rPr>
-        <w:t xml:space="preserve"> vai </w:t>
-      </w:r>
-      <w:proofErr w:type="spellStart"/>
-      <w:r>
-        <w:rPr>
-          <w:lang w:val="lv-LV"/>
-        </w:rPr>
-        <w:t>redis</w:t>
-      </w:r>
-      <w:proofErr w:type="spellEnd"/>
-      <w:r>
-        <w:rPr>
-          <w:lang w:val="lv-LV"/>
-        </w:rPr>
-        <w:t>, proti ārējus risinājumus.</w:t>
+        <w:t>Sistēma pēc ielādes ļauj responsīvi kārtot, šķirot metadatus. Ielādes laiku gan neizdevās uzlabot, jo pēc python3 atjaunināšanas kešošanai piedāvā tikai memcached vai redis, proti ārējus risinājumus.</w:t>
       </w:r>
     </w:p>
     <w:p>
@@ -6725,19 +7022,11 @@
           <w:lang w:val="lv-LV"/>
         </w:rPr>
       </w:pPr>
-      <w:proofErr w:type="spellStart"/>
-      <w:r>
-        <w:rPr>
-          <w:lang w:val="lv-LV"/>
-        </w:rPr>
-        <w:t>Mikrokontrolieru</w:t>
-      </w:r>
-      <w:proofErr w:type="spellEnd"/>
-      <w:r>
-        <w:rPr>
-          <w:lang w:val="lv-LV"/>
-        </w:rPr>
-        <w:t xml:space="preserve"> atmiņa tiek lietota maksimālā līmenī, kā redzams OUT OF MEMORY video.</w:t>
+      <w:r>
+        <w:rPr>
+          <w:lang w:val="lv-LV"/>
+        </w:rPr>
+        <w:t>Mikrokontrolieru atmiņa tiek lietota maksimālā līmenī, kā redzams OUT OF MEMORY video.</w:t>
       </w:r>
     </w:p>
     <w:p>
@@ -6786,21 +7075,7 @@
         <w:rPr>
           <w:lang w:val="lv-LV"/>
         </w:rPr>
-        <w:t xml:space="preserve">Kods ir samērā viegli un mazāk kā stundas laikā saslēdzams ar jebkuru centrmezglu, kas spēj darbināt </w:t>
-      </w:r>
-      <w:proofErr w:type="spellStart"/>
-      <w:r>
-        <w:rPr>
-          <w:lang w:val="lv-LV"/>
-        </w:rPr>
-        <w:t>micropython</w:t>
-      </w:r>
-      <w:proofErr w:type="spellEnd"/>
-      <w:r>
-        <w:rPr>
-          <w:lang w:val="lv-LV"/>
-        </w:rPr>
-        <w:t>, jo mainās tikai porti un varbūt LED specifika.</w:t>
+        <w:t>Kods ir samērā viegli un mazāk kā stundas laikā saslēdzams ar jebkuru centrmezglu, kas spēj darbināt micropython, jo mainās tikai porti un varbūt LED specifika.</w:t>
       </w:r>
     </w:p>
     <w:p>
@@ -6825,33 +7100,11 @@
           <w:lang w:val="lv-LV"/>
         </w:rPr>
       </w:pPr>
-      <w:proofErr w:type="spellStart"/>
-      <w:r>
-        <w:rPr>
-          <w:lang w:val="lv-LV"/>
-        </w:rPr>
-        <w:t>Kustināmības</w:t>
-      </w:r>
-      <w:proofErr w:type="spellEnd"/>
-      <w:r>
-        <w:rPr>
-          <w:lang w:val="lv-LV"/>
-        </w:rPr>
-        <w:t xml:space="preserve"> (</w:t>
-      </w:r>
-      <w:proofErr w:type="spellStart"/>
-      <w:r>
-        <w:rPr>
-          <w:lang w:val="lv-LV"/>
-        </w:rPr>
-        <w:t>Portability</w:t>
-      </w:r>
-      <w:proofErr w:type="spellEnd"/>
-      <w:r>
-        <w:rPr>
-          <w:lang w:val="lv-LV"/>
-        </w:rPr>
-        <w:t>)</w:t>
+      <w:r>
+        <w:rPr>
+          <w:lang w:val="lv-LV"/>
+        </w:rPr>
+        <w:t>Kustināmības (Portability)</w:t>
       </w:r>
       <w:r>
         <w:rPr>
@@ -7423,6 +7676,95 @@
     </w:lvl>
   </w:abstractNum>
   <w:abstractNum w:abstractNumId="4" w15:restartNumberingAfterBreak="0">
+    <w:nsid w:val="1E072450"/>
+    <w:multiLevelType w:val="hybridMultilevel"/>
+    <w:tmpl w:val="128A92B2"/>
+    <w:lvl w:ilvl="0" w:tplc="2000000F">
+      <w:start w:val="1"/>
+      <w:numFmt w:val="decimal"/>
+      <w:lvlText w:val="%1."/>
+      <w:lvlJc w:val="left"/>
+      <w:pPr>
+        <w:ind w:left="720" w:hanging="360"/>
+      </w:pPr>
+      <w:rPr>
+        <w:rFonts w:hint="default"/>
+      </w:rPr>
+    </w:lvl>
+    <w:lvl w:ilvl="1" w:tplc="20000019">
+      <w:start w:val="1"/>
+      <w:numFmt w:val="lowerLetter"/>
+      <w:lvlText w:val="%2."/>
+      <w:lvlJc w:val="left"/>
+      <w:pPr>
+        <w:ind w:left="1440" w:hanging="360"/>
+      </w:pPr>
+    </w:lvl>
+    <w:lvl w:ilvl="2" w:tplc="2000001B" w:tentative="1">
+      <w:start w:val="1"/>
+      <w:numFmt w:val="lowerRoman"/>
+      <w:lvlText w:val="%3."/>
+      <w:lvlJc w:val="right"/>
+      <w:pPr>
+        <w:ind w:left="2160" w:hanging="180"/>
+      </w:pPr>
+    </w:lvl>
+    <w:lvl w:ilvl="3" w:tplc="2000000F" w:tentative="1">
+      <w:start w:val="1"/>
+      <w:numFmt w:val="decimal"/>
+      <w:lvlText w:val="%4."/>
+      <w:lvlJc w:val="left"/>
+      <w:pPr>
+        <w:ind w:left="2880" w:hanging="360"/>
+      </w:pPr>
+    </w:lvl>
+    <w:lvl w:ilvl="4" w:tplc="20000019" w:tentative="1">
+      <w:start w:val="1"/>
+      <w:numFmt w:val="lowerLetter"/>
+      <w:lvlText w:val="%5."/>
+      <w:lvlJc w:val="left"/>
+      <w:pPr>
+        <w:ind w:left="3600" w:hanging="360"/>
+      </w:pPr>
+    </w:lvl>
+    <w:lvl w:ilvl="5" w:tplc="2000001B" w:tentative="1">
+      <w:start w:val="1"/>
+      <w:numFmt w:val="lowerRoman"/>
+      <w:lvlText w:val="%6."/>
+      <w:lvlJc w:val="right"/>
+      <w:pPr>
+        <w:ind w:left="4320" w:hanging="180"/>
+      </w:pPr>
+    </w:lvl>
+    <w:lvl w:ilvl="6" w:tplc="2000000F" w:tentative="1">
+      <w:start w:val="1"/>
+      <w:numFmt w:val="decimal"/>
+      <w:lvlText w:val="%7."/>
+      <w:lvlJc w:val="left"/>
+      <w:pPr>
+        <w:ind w:left="5040" w:hanging="360"/>
+      </w:pPr>
+    </w:lvl>
+    <w:lvl w:ilvl="7" w:tplc="20000019" w:tentative="1">
+      <w:start w:val="1"/>
+      <w:numFmt w:val="lowerLetter"/>
+      <w:lvlText w:val="%8."/>
+      <w:lvlJc w:val="left"/>
+      <w:pPr>
+        <w:ind w:left="5760" w:hanging="360"/>
+      </w:pPr>
+    </w:lvl>
+    <w:lvl w:ilvl="8" w:tplc="2000001B" w:tentative="1">
+      <w:start w:val="1"/>
+      <w:numFmt w:val="lowerRoman"/>
+      <w:lvlText w:val="%9."/>
+      <w:lvlJc w:val="right"/>
+      <w:pPr>
+        <w:ind w:left="6480" w:hanging="180"/>
+      </w:pPr>
+    </w:lvl>
+  </w:abstractNum>
+  <w:abstractNum w:abstractNumId="5" w15:restartNumberingAfterBreak="0">
     <w:nsid w:val="403272AD"/>
     <w:multiLevelType w:val="multilevel"/>
     <w:tmpl w:val="10000025"/>
@@ -7517,7 +7859,7 @@
       </w:pPr>
     </w:lvl>
   </w:abstractNum>
-  <w:abstractNum w:abstractNumId="5" w15:restartNumberingAfterBreak="0">
+  <w:abstractNum w:abstractNumId="6" w15:restartNumberingAfterBreak="0">
     <w:nsid w:val="45DB28A6"/>
     <w:multiLevelType w:val="hybridMultilevel"/>
     <w:tmpl w:val="595EF68E"/>
@@ -7630,7 +7972,120 @@
       </w:rPr>
     </w:lvl>
   </w:abstractNum>
-  <w:abstractNum w:abstractNumId="6" w15:restartNumberingAfterBreak="0">
+  <w:abstractNum w:abstractNumId="7" w15:restartNumberingAfterBreak="0">
+    <w:nsid w:val="481E6C55"/>
+    <w:multiLevelType w:val="hybridMultilevel"/>
+    <w:tmpl w:val="7F348290"/>
+    <w:lvl w:ilvl="0" w:tplc="CA9A3090">
+      <w:start w:val="149"/>
+      <w:numFmt w:val="bullet"/>
+      <w:lvlText w:val=""/>
+      <w:lvlJc w:val="left"/>
+      <w:pPr>
+        <w:ind w:left="1080" w:hanging="360"/>
+      </w:pPr>
+      <w:rPr>
+        <w:rFonts w:ascii="Symbol" w:eastAsiaTheme="minorHAnsi" w:hAnsi="Symbol" w:cstheme="minorBidi" w:hint="default"/>
+      </w:rPr>
+    </w:lvl>
+    <w:lvl w:ilvl="1" w:tplc="20000003" w:tentative="1">
+      <w:start w:val="1"/>
+      <w:numFmt w:val="bullet"/>
+      <w:lvlText w:val="o"/>
+      <w:lvlJc w:val="left"/>
+      <w:pPr>
+        <w:ind w:left="1800" w:hanging="360"/>
+      </w:pPr>
+      <w:rPr>
+        <w:rFonts w:ascii="Courier New" w:hAnsi="Courier New" w:cs="Courier New" w:hint="default"/>
+      </w:rPr>
+    </w:lvl>
+    <w:lvl w:ilvl="2" w:tplc="20000005" w:tentative="1">
+      <w:start w:val="1"/>
+      <w:numFmt w:val="bullet"/>
+      <w:lvlText w:val=""/>
+      <w:lvlJc w:val="left"/>
+      <w:pPr>
+        <w:ind w:left="2520" w:hanging="360"/>
+      </w:pPr>
+      <w:rPr>
+        <w:rFonts w:ascii="Wingdings" w:hAnsi="Wingdings" w:hint="default"/>
+      </w:rPr>
+    </w:lvl>
+    <w:lvl w:ilvl="3" w:tplc="20000001" w:tentative="1">
+      <w:start w:val="1"/>
+      <w:numFmt w:val="bullet"/>
+      <w:lvlText w:val=""/>
+      <w:lvlJc w:val="left"/>
+      <w:pPr>
+        <w:ind w:left="3240" w:hanging="360"/>
+      </w:pPr>
+      <w:rPr>
+        <w:rFonts w:ascii="Symbol" w:hAnsi="Symbol" w:hint="default"/>
+      </w:rPr>
+    </w:lvl>
+    <w:lvl w:ilvl="4" w:tplc="20000003" w:tentative="1">
+      <w:start w:val="1"/>
+      <w:numFmt w:val="bullet"/>
+      <w:lvlText w:val="o"/>
+      <w:lvlJc w:val="left"/>
+      <w:pPr>
+        <w:ind w:left="3960" w:hanging="360"/>
+      </w:pPr>
+      <w:rPr>
+        <w:rFonts w:ascii="Courier New" w:hAnsi="Courier New" w:cs="Courier New" w:hint="default"/>
+      </w:rPr>
+    </w:lvl>
+    <w:lvl w:ilvl="5" w:tplc="20000005" w:tentative="1">
+      <w:start w:val="1"/>
+      <w:numFmt w:val="bullet"/>
+      <w:lvlText w:val=""/>
+      <w:lvlJc w:val="left"/>
+      <w:pPr>
+        <w:ind w:left="4680" w:hanging="360"/>
+      </w:pPr>
+      <w:rPr>
+        <w:rFonts w:ascii="Wingdings" w:hAnsi="Wingdings" w:hint="default"/>
+      </w:rPr>
+    </w:lvl>
+    <w:lvl w:ilvl="6" w:tplc="20000001" w:tentative="1">
+      <w:start w:val="1"/>
+      <w:numFmt w:val="bullet"/>
+      <w:lvlText w:val=""/>
+      <w:lvlJc w:val="left"/>
+      <w:pPr>
+        <w:ind w:left="5400" w:hanging="360"/>
+      </w:pPr>
+      <w:rPr>
+        <w:rFonts w:ascii="Symbol" w:hAnsi="Symbol" w:hint="default"/>
+      </w:rPr>
+    </w:lvl>
+    <w:lvl w:ilvl="7" w:tplc="20000003" w:tentative="1">
+      <w:start w:val="1"/>
+      <w:numFmt w:val="bullet"/>
+      <w:lvlText w:val="o"/>
+      <w:lvlJc w:val="left"/>
+      <w:pPr>
+        <w:ind w:left="6120" w:hanging="360"/>
+      </w:pPr>
+      <w:rPr>
+        <w:rFonts w:ascii="Courier New" w:hAnsi="Courier New" w:cs="Courier New" w:hint="default"/>
+      </w:rPr>
+    </w:lvl>
+    <w:lvl w:ilvl="8" w:tplc="20000005" w:tentative="1">
+      <w:start w:val="1"/>
+      <w:numFmt w:val="bullet"/>
+      <w:lvlText w:val=""/>
+      <w:lvlJc w:val="left"/>
+      <w:pPr>
+        <w:ind w:left="6840" w:hanging="360"/>
+      </w:pPr>
+      <w:rPr>
+        <w:rFonts w:ascii="Wingdings" w:hAnsi="Wingdings" w:hint="default"/>
+      </w:rPr>
+    </w:lvl>
+  </w:abstractNum>
+  <w:abstractNum w:abstractNumId="8" w15:restartNumberingAfterBreak="0">
     <w:nsid w:val="4ED456E9"/>
     <w:multiLevelType w:val="hybridMultilevel"/>
     <w:tmpl w:val="03263EC2"/>
@@ -7742,7 +8197,7 @@
       </w:rPr>
     </w:lvl>
   </w:abstractNum>
-  <w:abstractNum w:abstractNumId="7" w15:restartNumberingAfterBreak="0">
+  <w:abstractNum w:abstractNumId="9" w15:restartNumberingAfterBreak="0">
     <w:nsid w:val="53B6436A"/>
     <w:multiLevelType w:val="hybridMultilevel"/>
     <w:tmpl w:val="EA624A62"/>
@@ -7854,7 +8309,7 @@
       </w:rPr>
     </w:lvl>
   </w:abstractNum>
-  <w:abstractNum w:abstractNumId="8" w15:restartNumberingAfterBreak="0">
+  <w:abstractNum w:abstractNumId="10" w15:restartNumberingAfterBreak="0">
     <w:nsid w:val="5E4C6601"/>
     <w:multiLevelType w:val="hybridMultilevel"/>
     <w:tmpl w:val="091828BE"/>
@@ -7967,7 +8422,7 @@
       </w:rPr>
     </w:lvl>
   </w:abstractNum>
-  <w:abstractNum w:abstractNumId="9" w15:restartNumberingAfterBreak="0">
+  <w:abstractNum w:abstractNumId="11" w15:restartNumberingAfterBreak="0">
     <w:nsid w:val="6DC974FE"/>
     <w:multiLevelType w:val="hybridMultilevel"/>
     <w:tmpl w:val="38462AAE"/>
@@ -8079,7 +8534,7 @@
       </w:rPr>
     </w:lvl>
   </w:abstractNum>
-  <w:abstractNum w:abstractNumId="10" w15:restartNumberingAfterBreak="0">
+  <w:abstractNum w:abstractNumId="12" w15:restartNumberingAfterBreak="0">
     <w:nsid w:val="6E882E6E"/>
     <w:multiLevelType w:val="hybridMultilevel"/>
     <w:tmpl w:val="D3283B4E"/>
@@ -8192,7 +8647,7 @@
       </w:rPr>
     </w:lvl>
   </w:abstractNum>
-  <w:abstractNum w:abstractNumId="11" w15:restartNumberingAfterBreak="0">
+  <w:abstractNum w:abstractNumId="13" w15:restartNumberingAfterBreak="0">
     <w:nsid w:val="73EC7920"/>
     <w:multiLevelType w:val="hybridMultilevel"/>
     <w:tmpl w:val="B19AFECA"/>
@@ -8339,7 +8794,7 @@
     <w:abstractNumId w:val="2"/>
   </w:num>
   <w:num w:numId="3" w16cid:durableId="1728213935">
-    <w:abstractNumId w:val="8"/>
+    <w:abstractNumId w:val="10"/>
   </w:num>
   <w:num w:numId="4" w16cid:durableId="1824732951">
     <w:abstractNumId w:val="1"/>
@@ -8348,28 +8803,34 @@
     <w:abstractNumId w:val="0"/>
   </w:num>
   <w:num w:numId="6" w16cid:durableId="648748260">
-    <w:abstractNumId w:val="6"/>
+    <w:abstractNumId w:val="8"/>
   </w:num>
   <w:num w:numId="7" w16cid:durableId="10425477">
-    <w:abstractNumId w:val="7"/>
+    <w:abstractNumId w:val="9"/>
   </w:num>
   <w:num w:numId="8" w16cid:durableId="1605267704">
     <w:abstractNumId w:val="3"/>
   </w:num>
   <w:num w:numId="9" w16cid:durableId="1830823400">
-    <w:abstractNumId w:val="10"/>
+    <w:abstractNumId w:val="12"/>
   </w:num>
   <w:num w:numId="10" w16cid:durableId="864320081">
+    <w:abstractNumId w:val="13"/>
+  </w:num>
+  <w:num w:numId="11" w16cid:durableId="1277560213">
     <w:abstractNumId w:val="11"/>
   </w:num>
-  <w:num w:numId="11" w16cid:durableId="1277560213">
-    <w:abstractNumId w:val="9"/>
+  <w:num w:numId="12" w16cid:durableId="1500927366">
+    <w:abstractNumId w:val="5"/>
   </w:num>
-  <w:num w:numId="12" w16cid:durableId="1500927366">
+  <w:num w:numId="13" w16cid:durableId="1757093117">
+    <w:abstractNumId w:val="6"/>
+  </w:num>
+  <w:num w:numId="14" w16cid:durableId="366956439">
     <w:abstractNumId w:val="4"/>
   </w:num>
-  <w:num w:numId="13" w16cid:durableId="1757093117">
-    <w:abstractNumId w:val="5"/>
+  <w:num w:numId="15" w16cid:durableId="1734616085">
+    <w:abstractNumId w:val="7"/>
   </w:num>
 </w:numbering>
 </file>
@@ -9467,6 +9928,25 @@
     <w:uiPriority w:val="99"/>
     <w:rsid w:val="006E7CB1"/>
   </w:style>
+  <w:style w:type="table" w:styleId="TableGrid">
+    <w:name w:val="Table Grid"/>
+    <w:basedOn w:val="TableNormal"/>
+    <w:uiPriority w:val="39"/>
+    <w:rsid w:val="00732209"/>
+    <w:pPr>
+      <w:spacing w:after="0" w:line="240" w:lineRule="auto"/>
+    </w:pPr>
+    <w:tblPr>
+      <w:tblBorders>
+        <w:top w:val="single" w:sz="4" w:space="0" w:color="auto"/>
+        <w:left w:val="single" w:sz="4" w:space="0" w:color="auto"/>
+        <w:bottom w:val="single" w:sz="4" w:space="0" w:color="auto"/>
+        <w:right w:val="single" w:sz="4" w:space="0" w:color="auto"/>
+        <w:insideH w:val="single" w:sz="4" w:space="0" w:color="auto"/>
+        <w:insideV w:val="single" w:sz="4" w:space="0" w:color="auto"/>
+      </w:tblBorders>
+    </w:tblPr>
+  </w:style>
 </w:styles>
 </file>
 

</xml_diff>